<commit_message>
Lab 7 de Programacao 6 aplicado no repositorio do grupo
Branch lab7-djordan publicada no GitLab a partir de LB-6, com as tres
atividades implementadas em codigo e nao apenas descritas:

Atividade #1 - tres indices de desempenho, AsNoTracking, ranking paginado com
desempate estavel, operacoes em massa com ExecuteUpdate/ExecuteDelete
Atividade #2 - Set de jogadores conectados no GameHub, RankingCacheService com
Sorted Set e cache do top 10, revogacao de JWT com TTL casado ao token
Atividade #3 - replica de leitura em streaming no docker-compose, connection
pooling do Npgsql, sharding documentado como escala futura

Tres relatorios em docs/Lab07-activityN-DjordanMoura.md, seguindo o padrao de
nomes do enunciado.

O relatorio da entrega deixa de listar 'nada aplicado no repositorio' como
pendencia. Seguem em aberto a migration e as medicoes, que dependem do SDK do
.NET e do PostgreSQL no ar.

Co-Authored-By: Claude Opus 5 <noreply@anthropic.com>
</commit_message>
<xml_diff>
--- a/entregas/Programação 6/Lab Semana 07/entrega/Lab Semana 07 - Programação 6.docx
+++ b/entregas/Programação 6/Lab Semana 07/entrega/Lab Semana 07 - Programação 6.docx
@@ -7779,6 +7779,41 @@
           <w:sz w:val="24"/>
           <w:szCs w:val="24"/>
         </w:rPr>
+        <w:t xml:space="preserve">O código desta análise está aplicado na branch </w:t>
+      </w:r>
+      <w:r>
+        <w:rPr>
+          <w:rFonts w:ascii="Consolas" w:hAnsi="Consolas" w:cs="Consolas" w:eastAsia="Consolas"/>
+          <w:color w:val="000000"/>
+          <w:shd w:val="clear" w:fill="F2F2F2"/>
+          <w:sz w:val="24"/>
+          <w:szCs w:val="24"/>
+        </w:rPr>
+        <w:t xml:space="preserve">lab7-djordan</w:t>
+      </w:r>
+      <w:r>
+        <w:rPr>
+          <w:rFonts w:ascii="Open Sans" w:hAnsi="Open Sans" w:cs="Open Sans" w:eastAsia="Open Sans"/>
+          <w:color w:val="000000"/>
+          <w:sz w:val="24"/>
+          <w:szCs w:val="24"/>
+        </w:rPr>
+        <w:t xml:space="preserve"> do repositório do grupo.</w:t>
+      </w:r>
+    </w:p>
+    <w:p>
+      <w:pPr>
+        <w:spacing w:after="120" w:before="120" w:line="276" w:lineRule="auto"/>
+        <w:ind w:firstLine="0" w:start="0"/>
+        <w:jc w:val="both"/>
+      </w:pPr>
+      <w:r>
+        <w:rPr>
+          <w:rFonts w:ascii="Open Sans" w:hAnsi="Open Sans" w:cs="Open Sans" w:eastAsia="Open Sans"/>
+          <w:color w:val="000000"/>
+          <w:sz w:val="24"/>
+          <w:szCs w:val="24"/>
+        </w:rPr>
         <w:t xml:space="preserve">O laboratório 6 resolveu a comunicação; este ataca o que a sustenta. São problemas de natureza diferente: lá o gargalo era latência de entrega, aqui é custo de consulta — e custo de consulta só aparece com volume, o que o torna invisível em desenvolvimento e visível em apresentação.</w:t>
       </w:r>
     </w:p>

</xml_diff>

<commit_message>
Lab 7 de Programacao 6: medicoes reais e bugs achados ao testar
Substitui os tres [PENDENTE] do relatorio por numeros medidos com Postgres e
Redis reais (EXPLAIN ANALYZE, tracking vs AsNoTracking, cache-aside, sorted
set, TTL de revogacao de JWT, desempate de paginacao). Documenta tambem dois
bugs achados ao rodar de verdade e ja corrigidos na branch lab7-djordan do
repositorio do grupo: a replica de leitura nunca subia (YAML quebrado,
pg_hba.conf sem entrada de replicacao, processo rodando como root) e o Set
jogadores:online so encolhia com LeaveRoom explicito, nunca em queda de
conexao.

_pendencias.md sai porque nao sobrou nenhuma pendencia. .docx regenerado com
diagramas e blocos de codigo como imagem.

Co-Authored-By: Claude Sonnet 5 <noreply@anthropic.com>
</commit_message>
<xml_diff>
--- a/entregas/Programação 6/Lab Semana 07/entrega/Lab Semana 07 - Programação 6.docx
+++ b/entregas/Programação 6/Lab Semana 07/entrega/Lab Semana 07 - Programação 6.docx
@@ -857,7 +857,7 @@
       <w:r>
         <w:drawing>
           <wp:inline>
-            <wp:extent cx="5400000" cy="975904"/>
+            <wp:extent cx="5400000" cy="966609"/>
             <wp:docPr id="101" name="Imagem 101" descr=""/>
             <wp:cNvGraphicFramePr>
               <a:graphicFrameLocks noChangeAspect="true"/>
@@ -878,7 +878,7 @@
                   <pic:spPr>
                     <a:xfrm>
                       <a:off x="0" y="0"/>
-                      <a:ext cx="5400000" cy="975904"/>
+                      <a:ext cx="5400000" cy="966609"/>
                     </a:xfrm>
                     <a:prstGeom prst="rect">
                       <a:avLst/>
@@ -1227,7 +1227,7 @@
       <w:r>
         <w:drawing>
           <wp:inline>
-            <wp:extent cx="5400000" cy="1109589"/>
+            <wp:extent cx="5400000" cy="1099022"/>
             <wp:docPr id="104" name="Imagem 104" descr=""/>
             <wp:cNvGraphicFramePr>
               <a:graphicFrameLocks noChangeAspect="true"/>
@@ -1248,7 +1248,7 @@
                   <pic:spPr>
                     <a:xfrm>
                       <a:off x="0" y="0"/>
-                      <a:ext cx="5400000" cy="1109589"/>
+                      <a:ext cx="5400000" cy="1099022"/>
                     </a:xfrm>
                     <a:prstGeom prst="rect">
                       <a:avLst/>
@@ -1841,7 +1841,7 @@
       <w:r>
         <w:drawing>
           <wp:inline>
-            <wp:extent cx="5400000" cy="2081739"/>
+            <wp:extent cx="5400000" cy="2073913"/>
             <wp:docPr id="108" name="Imagem 108" descr=""/>
             <wp:cNvGraphicFramePr>
               <a:graphicFrameLocks noChangeAspect="true"/>
@@ -1862,7 +1862,7 @@
                   <pic:spPr>
                     <a:xfrm>
                       <a:off x="0" y="0"/>
-                      <a:ext cx="5400000" cy="2081739"/>
+                      <a:ext cx="5400000" cy="2073913"/>
                     </a:xfrm>
                     <a:prstGeom prst="rect">
                       <a:avLst/>
@@ -2262,7 +2262,7 @@
       <w:r>
         <w:drawing>
           <wp:inline>
-            <wp:extent cx="5400000" cy="2011765"/>
+            <wp:extent cx="5400000" cy="2004202"/>
             <wp:docPr id="110" name="Imagem 110" descr=""/>
             <wp:cNvGraphicFramePr>
               <a:graphicFrameLocks noChangeAspect="true"/>
@@ -2283,7 +2283,7 @@
                   <pic:spPr>
                     <a:xfrm>
                       <a:off x="0" y="0"/>
-                      <a:ext cx="5400000" cy="2011765"/>
+                      <a:ext cx="5400000" cy="2004202"/>
                     </a:xfrm>
                     <a:prstGeom prst="rect">
                       <a:avLst/>
@@ -3083,7 +3083,7 @@
       <w:r>
         <w:drawing>
           <wp:inline>
-            <wp:extent cx="5400000" cy="1991604"/>
+            <wp:extent cx="5400000" cy="1983508"/>
             <wp:docPr id="112" name="Imagem 112" descr=""/>
             <wp:cNvGraphicFramePr>
               <a:graphicFrameLocks noChangeAspect="true"/>
@@ -3104,7 +3104,7 @@
                   <pic:spPr>
                     <a:xfrm>
                       <a:off x="0" y="0"/>
-                      <a:ext cx="5400000" cy="1991604"/>
+                      <a:ext cx="5400000" cy="1983508"/>
                     </a:xfrm>
                     <a:prstGeom prst="rect">
                       <a:avLst/>
@@ -3887,7 +3887,7 @@
       <w:r>
         <w:drawing>
           <wp:inline>
-            <wp:extent cx="5400000" cy="1888625"/>
+            <wp:extent cx="5400000" cy="1879457"/>
             <wp:docPr id="116" name="Imagem 116" descr=""/>
             <wp:cNvGraphicFramePr>
               <a:graphicFrameLocks noChangeAspect="true"/>
@@ -3908,7 +3908,7 @@
                   <pic:spPr>
                     <a:xfrm>
                       <a:off x="0" y="0"/>
-                      <a:ext cx="5400000" cy="1888625"/>
+                      <a:ext cx="5400000" cy="1879457"/>
                     </a:xfrm>
                     <a:prstGeom prst="rect">
                       <a:avLst/>
@@ -5179,6 +5179,1802 @@
           <w:b/>
           <w:bCs/>
           <w:color w:val="000000"/>
+          <w:sz w:val="26"/>
+          <w:szCs w:val="26"/>
+        </w:rPr>
+        <w:t xml:space="preserve">6.1. Medições feitas com PostgreSQL e Redis reais</w:t>
+      </w:r>
+    </w:p>
+    <w:p>
+      <w:pPr>
+        <w:spacing w:after="120" w:before="120" w:line="276" w:lineRule="auto"/>
+        <w:ind w:firstLine="0" w:start="0"/>
+        <w:jc w:val="both"/>
+      </w:pPr>
+      <w:r>
+        <w:rPr>
+          <w:rFonts w:ascii="Open Sans" w:hAnsi="Open Sans" w:cs="Open Sans" w:eastAsia="Open Sans"/>
+          <w:color w:val="000000"/>
+          <w:sz w:val="24"/>
+          <w:szCs w:val="24"/>
+        </w:rPr>
+        <w:t xml:space="preserve">A migration </w:t>
+      </w:r>
+      <w:r>
+        <w:rPr>
+          <w:rFonts w:ascii="Consolas" w:hAnsi="Consolas" w:cs="Consolas" w:eastAsia="Consolas"/>
+          <w:color w:val="000000"/>
+          <w:shd w:val="clear" w:fill="F2F2F2"/>
+          <w:sz w:val="24"/>
+          <w:szCs w:val="24"/>
+        </w:rPr>
+        <w:t xml:space="preserve">AddPerformanceIndexes</w:t>
+      </w:r>
+      <w:r>
+        <w:rPr>
+          <w:rFonts w:ascii="Open Sans" w:hAnsi="Open Sans" w:cs="Open Sans" w:eastAsia="Open Sans"/>
+          <w:color w:val="000000"/>
+          <w:sz w:val="24"/>
+          <w:szCs w:val="24"/>
+        </w:rPr>
+        <w:t xml:space="preserve"> foi gerada com </w:t>
+      </w:r>
+      <w:r>
+        <w:rPr>
+          <w:rFonts w:ascii="Consolas" w:hAnsi="Consolas" w:cs="Consolas" w:eastAsia="Consolas"/>
+          <w:color w:val="000000"/>
+          <w:shd w:val="clear" w:fill="F2F2F2"/>
+          <w:sz w:val="24"/>
+          <w:szCs w:val="24"/>
+        </w:rPr>
+        <w:t xml:space="preserve">dotnet ef migrations add</w:t>
+      </w:r>
+      <w:r>
+        <w:rPr>
+          <w:rFonts w:ascii="Open Sans" w:hAnsi="Open Sans" w:cs="Open Sans" w:eastAsia="Open Sans"/>
+          <w:color w:val="000000"/>
+          <w:sz w:val="24"/>
+          <w:szCs w:val="24"/>
+        </w:rPr>
+        <w:t xml:space="preserve"> e aplicada com </w:t>
+      </w:r>
+      <w:r>
+        <w:rPr>
+          <w:rFonts w:ascii="Consolas" w:hAnsi="Consolas" w:cs="Consolas" w:eastAsia="Consolas"/>
+          <w:color w:val="000000"/>
+          <w:shd w:val="clear" w:fill="F2F2F2"/>
+          <w:sz w:val="24"/>
+          <w:szCs w:val="24"/>
+        </w:rPr>
+        <w:t xml:space="preserve">dotnet ef database update</w:t>
+      </w:r>
+      <w:r>
+        <w:rPr>
+          <w:rFonts w:ascii="Open Sans" w:hAnsi="Open Sans" w:cs="Open Sans" w:eastAsia="Open Sans"/>
+          <w:color w:val="000000"/>
+          <w:sz w:val="24"/>
+          <w:szCs w:val="24"/>
+        </w:rPr>
+        <w:t xml:space="preserve">, ambos sem erro. As medições abaixo rodaram sobre essa migration, com </w:t>
+      </w:r>
+      <w:r>
+        <w:rPr>
+          <w:rFonts w:ascii="Consolas" w:hAnsi="Consolas" w:cs="Consolas" w:eastAsia="Consolas"/>
+          <w:color w:val="000000"/>
+          <w:shd w:val="clear" w:fill="F2F2F2"/>
+          <w:sz w:val="24"/>
+          <w:szCs w:val="24"/>
+        </w:rPr>
+        <w:t xml:space="preserve">GameSessions</w:t>
+      </w:r>
+      <w:r>
+        <w:rPr>
+          <w:rFonts w:ascii="Open Sans" w:hAnsi="Open Sans" w:cs="Open Sans" w:eastAsia="Open Sans"/>
+          <w:color w:val="000000"/>
+          <w:sz w:val="24"/>
+          <w:szCs w:val="24"/>
+        </w:rPr>
+        <w:t xml:space="preserve"> populada com 50 mil linhas e </w:t>
+      </w:r>
+      <w:r>
+        <w:rPr>
+          <w:rFonts w:ascii="Consolas" w:hAnsi="Consolas" w:cs="Consolas" w:eastAsia="Consolas"/>
+          <w:color w:val="000000"/>
+          <w:shd w:val="clear" w:fill="F2F2F2"/>
+          <w:sz w:val="24"/>
+          <w:szCs w:val="24"/>
+        </w:rPr>
+        <w:t xml:space="preserve">Jogadores</w:t>
+      </w:r>
+      <w:r>
+        <w:rPr>
+          <w:rFonts w:ascii="Open Sans" w:hAnsi="Open Sans" w:cs="Open Sans" w:eastAsia="Open Sans"/>
+          <w:color w:val="000000"/>
+          <w:sz w:val="24"/>
+          <w:szCs w:val="24"/>
+        </w:rPr>
+        <w:t xml:space="preserve"> com 20 mil, para que o volume seja grande o bastante para o planejador do PostgreSQL preferir o índice — com poucas linhas ele prefere </w:t>
+      </w:r>
+      <w:r>
+        <w:rPr>
+          <w:rFonts w:ascii="Open Sans" w:hAnsi="Open Sans" w:cs="Open Sans" w:eastAsia="Open Sans"/>
+          <w:i/>
+          <w:iCs/>
+          <w:color w:val="000000"/>
+          <w:sz w:val="24"/>
+          <w:szCs w:val="24"/>
+        </w:rPr>
+        <w:t xml:space="preserve">seq scan</w:t>
+      </w:r>
+      <w:r>
+        <w:rPr>
+          <w:rFonts w:ascii="Open Sans" w:hAnsi="Open Sans" w:cs="Open Sans" w:eastAsia="Open Sans"/>
+          <w:color w:val="000000"/>
+          <w:sz w:val="24"/>
+          <w:szCs w:val="24"/>
+        </w:rPr>
+        <w:t xml:space="preserve">, como já registrado na seção 3.1.</w:t>
+      </w:r>
+    </w:p>
+    <w:p>
+      <w:pPr>
+        <w:spacing w:after="120" w:before="120" w:line="276" w:lineRule="auto"/>
+        <w:ind w:firstLine="0" w:start="0"/>
+        <w:jc w:val="both"/>
+      </w:pPr>
+      <w:r>
+        <w:rPr>
+          <w:rFonts w:ascii="Open Sans" w:hAnsi="Open Sans" w:cs="Open Sans" w:eastAsia="Open Sans"/>
+          <w:b/>
+          <w:bCs/>
+          <w:color w:val="000000"/>
+          <w:sz w:val="24"/>
+          <w:szCs w:val="24"/>
+        </w:rPr>
+        <w:t xml:space="preserve">Índice de `GameSession.Status`.</w:t>
+      </w:r>
+      <w:r>
+        <w:rPr>
+          <w:rFonts w:ascii="Open Sans" w:hAnsi="Open Sans" w:cs="Open Sans" w:eastAsia="Open Sans"/>
+          <w:color w:val="000000"/>
+          <w:sz w:val="24"/>
+          <w:szCs w:val="24"/>
+        </w:rPr>
+        <w:t xml:space="preserve"> </w:t>
+      </w:r>
+      <w:r>
+        <w:rPr>
+          <w:rFonts w:ascii="Consolas" w:hAnsi="Consolas" w:cs="Consolas" w:eastAsia="Consolas"/>
+          <w:color w:val="000000"/>
+          <w:shd w:val="clear" w:fill="F2F2F2"/>
+          <w:sz w:val="24"/>
+          <w:szCs w:val="24"/>
+        </w:rPr>
+        <w:t xml:space="preserve">EXPLAIN ANALYZE</w:t>
+      </w:r>
+      <w:r>
+        <w:rPr>
+          <w:rFonts w:ascii="Open Sans" w:hAnsi="Open Sans" w:cs="Open Sans" w:eastAsia="Open Sans"/>
+          <w:color w:val="000000"/>
+          <w:sz w:val="24"/>
+          <w:szCs w:val="24"/>
+        </w:rPr>
+        <w:t xml:space="preserve"> na mesma consulta, com e sem o índice disponível:</w:t>
+      </w:r>
+    </w:p>
+    <w:tbl>
+      <w:tblPr>
+        <w:tblW w:w="5000" w:type="pct"/>
+        <w:tblBorders>
+          <w:top w:val="single" w:sz="4" w:space="0" w:color="D8DEE4"/>
+          <w:left w:val="single" w:sz="4" w:space="0" w:color="D8DEE4"/>
+          <w:bottom w:val="single" w:sz="4" w:space="0" w:color="D8DEE4"/>
+          <w:right w:val="single" w:sz="4" w:space="0" w:color="D8DEE4"/>
+        </w:tblBorders>
+        <w:tblCellMar>
+          <w:top w:w="80" w:type="dxa"/>
+          <w:left w:w="140" w:type="dxa"/>
+          <w:bottom w:w="80" w:type="dxa"/>
+          <w:right w:w="140" w:type="dxa"/>
+        </w:tblCellMar>
+      </w:tblPr>
+      <w:tr>
+        <w:tc>
+          <w:tcPr>
+            <w:tcW w:w="5000" w:type="pct"/>
+            <w:shd w:val="clear" w:fill="F6F8FA"/>
+          </w:tcPr>
+          <w:p>
+            <w:pPr>
+              <w:spacing w:after="0" w:before="40" w:line="240" w:lineRule="auto"/>
+              <w:ind w:firstLine="0" w:start="0"/>
+              <w:jc w:val="start"/>
+            </w:pPr>
+            <w:r>
+              <w:rPr>
+                <w:rFonts w:ascii="Consolas" w:hAnsi="Consolas" w:cs="Consolas" w:eastAsia="Consolas"/>
+                <w:color w:val="1F2328"/>
+                <w:sz w:val="18"/>
+                <w:szCs w:val="18"/>
+              </w:rPr>
+              <w:t xml:space="preserve">Sem indice: Seq Scan on "GameSessions"     — Execution Time: 4.895 ms (49900 linhas descartadas)</w:t>
+            </w:r>
+          </w:p>
+          <w:p>
+            <w:pPr>
+              <w:spacing w:after="0" w:before="0" w:line="240" w:lineRule="auto"/>
+              <w:ind w:firstLine="0" w:start="0"/>
+              <w:jc w:val="start"/>
+            </w:pPr>
+            <w:r>
+              <w:rPr>
+                <w:rFonts w:ascii="Consolas" w:hAnsi="Consolas" w:cs="Consolas" w:eastAsia="Consolas"/>
+                <w:color w:val="1F2328"/>
+                <w:sz w:val="18"/>
+                <w:szCs w:val="18"/>
+              </w:rPr>
+              <w:t xml:space="preserve">Com indice: Index Scan using IX_GameSession_Status — Execution Time: 0.482 ms</w:t>
+            </w:r>
+          </w:p>
+        </w:tc>
+      </w:tr>
+    </w:tbl>
+    <w:p>
+      <w:pPr>
+        <w:spacing w:after="60" w:before="0" w:line="276" w:lineRule="auto"/>
+        <w:ind w:firstLine="0" w:start="0"/>
+        <w:jc w:val="start"/>
+      </w:pPr>
+    </w:p>
+    <w:p>
+      <w:pPr>
+        <w:spacing w:after="120" w:before="120" w:line="276" w:lineRule="auto"/>
+        <w:ind w:firstLine="0" w:start="0"/>
+        <w:jc w:val="both"/>
+      </w:pPr>
+      <w:r>
+        <w:rPr>
+          <w:rFonts w:ascii="Open Sans" w:hAnsi="Open Sans" w:cs="Open Sans" w:eastAsia="Open Sans"/>
+          <w:color w:val="000000"/>
+          <w:sz w:val="24"/>
+          <w:szCs w:val="24"/>
+        </w:rPr>
+        <w:t xml:space="preserve">Confirma a previsão da seção 3.1: troca de </w:t>
+      </w:r>
+      <w:r>
+        <w:rPr>
+          <w:rFonts w:ascii="Consolas" w:hAnsi="Consolas" w:cs="Consolas" w:eastAsia="Consolas"/>
+          <w:color w:val="000000"/>
+          <w:shd w:val="clear" w:fill="F2F2F2"/>
+          <w:sz w:val="24"/>
+          <w:szCs w:val="24"/>
+        </w:rPr>
+        <w:t xml:space="preserve">Seq Scan</w:t>
+      </w:r>
+      <w:r>
+        <w:rPr>
+          <w:rFonts w:ascii="Open Sans" w:hAnsi="Open Sans" w:cs="Open Sans" w:eastAsia="Open Sans"/>
+          <w:color w:val="000000"/>
+          <w:sz w:val="24"/>
+          <w:szCs w:val="24"/>
+        </w:rPr>
+        <w:t xml:space="preserve"> por </w:t>
+      </w:r>
+      <w:r>
+        <w:rPr>
+          <w:rFonts w:ascii="Consolas" w:hAnsi="Consolas" w:cs="Consolas" w:eastAsia="Consolas"/>
+          <w:color w:val="000000"/>
+          <w:shd w:val="clear" w:fill="F2F2F2"/>
+          <w:sz w:val="24"/>
+          <w:szCs w:val="24"/>
+        </w:rPr>
+        <w:t xml:space="preserve">Index Scan</w:t>
+      </w:r>
+      <w:r>
+        <w:rPr>
+          <w:rFonts w:ascii="Open Sans" w:hAnsi="Open Sans" w:cs="Open Sans" w:eastAsia="Open Sans"/>
+          <w:color w:val="000000"/>
+          <w:sz w:val="24"/>
+          <w:szCs w:val="24"/>
+        </w:rPr>
+        <w:t xml:space="preserve">, ~10x mais rápido.</w:t>
+      </w:r>
+    </w:p>
+    <w:p>
+      <w:pPr>
+        <w:spacing w:after="120" w:before="120" w:line="276" w:lineRule="auto"/>
+        <w:ind w:firstLine="0" w:start="0"/>
+        <w:jc w:val="both"/>
+      </w:pPr>
+      <w:r>
+        <w:rPr>
+          <w:rFonts w:ascii="Open Sans" w:hAnsi="Open Sans" w:cs="Open Sans" w:eastAsia="Open Sans"/>
+          <w:b/>
+          <w:bCs/>
+          <w:color w:val="000000"/>
+          <w:sz w:val="24"/>
+          <w:szCs w:val="24"/>
+        </w:rPr>
+        <w:t xml:space="preserve">`AsNoTracking()` na consulta de ranking.</w:t>
+      </w:r>
+      <w:r>
+        <w:rPr>
+          <w:rFonts w:ascii="Open Sans" w:hAnsi="Open Sans" w:cs="Open Sans" w:eastAsia="Open Sans"/>
+          <w:color w:val="000000"/>
+          <w:sz w:val="24"/>
+          <w:szCs w:val="24"/>
+        </w:rPr>
+        <w:t xml:space="preserve"> Carregando as 20 mil linhas de </w:t>
+      </w:r>
+      <w:r>
+        <w:rPr>
+          <w:rFonts w:ascii="Consolas" w:hAnsi="Consolas" w:cs="Consolas" w:eastAsia="Consolas"/>
+          <w:color w:val="000000"/>
+          <w:shd w:val="clear" w:fill="F2F2F2"/>
+          <w:sz w:val="24"/>
+          <w:szCs w:val="24"/>
+        </w:rPr>
+        <w:t xml:space="preserve">Jogadores</w:t>
+      </w:r>
+      <w:r>
+        <w:rPr>
+          <w:rFonts w:ascii="Open Sans" w:hAnsi="Open Sans" w:cs="Open Sans" w:eastAsia="Open Sans"/>
+          <w:color w:val="000000"/>
+          <w:sz w:val="24"/>
+          <w:szCs w:val="24"/>
+        </w:rPr>
+        <w:t xml:space="preserve"> (cenário ampliado para tornar o custo do change tracker visível — o endpoint real usa </w:t>
+      </w:r>
+      <w:r>
+        <w:rPr>
+          <w:rFonts w:ascii="Consolas" w:hAnsi="Consolas" w:cs="Consolas" w:eastAsia="Consolas"/>
+          <w:color w:val="000000"/>
+          <w:shd w:val="clear" w:fill="F2F2F2"/>
+          <w:sz w:val="24"/>
+          <w:szCs w:val="24"/>
+        </w:rPr>
+        <w:t xml:space="preserve">Take(10)</w:t>
+      </w:r>
+      <w:r>
+        <w:rPr>
+          <w:rFonts w:ascii="Open Sans" w:hAnsi="Open Sans" w:cs="Open Sans" w:eastAsia="Open Sans"/>
+          <w:color w:val="000000"/>
+          <w:sz w:val="24"/>
+          <w:szCs w:val="24"/>
+        </w:rPr>
+        <w:t xml:space="preserve"> ou </w:t>
+      </w:r>
+      <w:r>
+        <w:rPr>
+          <w:rFonts w:ascii="Consolas" w:hAnsi="Consolas" w:cs="Consolas" w:eastAsia="Consolas"/>
+          <w:color w:val="000000"/>
+          <w:shd w:val="clear" w:fill="F2F2F2"/>
+          <w:sz w:val="24"/>
+          <w:szCs w:val="24"/>
+        </w:rPr>
+        <w:t xml:space="preserve">Take(20)</w:t>
+      </w:r>
+      <w:r>
+        <w:rPr>
+          <w:rFonts w:ascii="Open Sans" w:hAnsi="Open Sans" w:cs="Open Sans" w:eastAsia="Open Sans"/>
+          <w:color w:val="000000"/>
+          <w:sz w:val="24"/>
+          <w:szCs w:val="24"/>
+        </w:rPr>
+        <w:t xml:space="preserve">, onde a diferença absoluta é pequena demais para medir):</w:t>
+      </w:r>
+    </w:p>
+    <w:tbl>
+      <w:tblPr>
+        <w:tblW w:w="5000" w:type="pct"/>
+        <w:tblBorders>
+          <w:top w:val="single" w:sz="4" w:space="0" w:color="D8DEE4"/>
+          <w:left w:val="single" w:sz="4" w:space="0" w:color="D8DEE4"/>
+          <w:bottom w:val="single" w:sz="4" w:space="0" w:color="D8DEE4"/>
+          <w:right w:val="single" w:sz="4" w:space="0" w:color="D8DEE4"/>
+        </w:tblBorders>
+        <w:tblCellMar>
+          <w:top w:w="80" w:type="dxa"/>
+          <w:left w:w="140" w:type="dxa"/>
+          <w:bottom w:w="80" w:type="dxa"/>
+          <w:right w:w="140" w:type="dxa"/>
+        </w:tblCellMar>
+      </w:tblPr>
+      <w:tr>
+        <w:tc>
+          <w:tcPr>
+            <w:tcW w:w="5000" w:type="pct"/>
+            <w:shd w:val="clear" w:fill="F6F8FA"/>
+          </w:tcPr>
+          <w:p>
+            <w:pPr>
+              <w:spacing w:after="0" w:before="40" w:line="240" w:lineRule="auto"/>
+              <w:ind w:firstLine="0" w:start="0"/>
+              <w:jc w:val="start"/>
+            </w:pPr>
+            <w:r>
+              <w:rPr>
+                <w:rFonts w:ascii="Consolas" w:hAnsi="Consolas" w:cs="Consolas" w:eastAsia="Consolas"/>
+                <w:color w:val="1F2328"/>
+                <w:sz w:val="18"/>
+                <w:szCs w:val="18"/>
+              </w:rPr>
+              <w:t xml:space="preserve">Com tracking (padrao):  247 ms | 18.040 KB alocados</w:t>
+            </w:r>
+          </w:p>
+          <w:p>
+            <w:pPr>
+              <w:spacing w:after="0" w:before="0" w:line="240" w:lineRule="auto"/>
+              <w:ind w:firstLine="0" w:start="0"/>
+              <w:jc w:val="start"/>
+            </w:pPr>
+            <w:r>
+              <w:rPr>
+                <w:rFonts w:ascii="Consolas" w:hAnsi="Consolas" w:cs="Consolas" w:eastAsia="Consolas"/>
+                <w:color w:val="1F2328"/>
+                <w:sz w:val="18"/>
+                <w:szCs w:val="18"/>
+              </w:rPr>
+              <w:t xml:space="preserve">Com AsNoTracking():     121 ms |  9.097 KB alocados</w:t>
+            </w:r>
+          </w:p>
+        </w:tc>
+      </w:tr>
+    </w:tbl>
+    <w:p>
+      <w:pPr>
+        <w:spacing w:after="60" w:before="0" w:line="276" w:lineRule="auto"/>
+        <w:ind w:firstLine="0" w:start="0"/>
+        <w:jc w:val="start"/>
+      </w:pPr>
+    </w:p>
+    <w:p>
+      <w:pPr>
+        <w:spacing w:after="120" w:before="120" w:line="276" w:lineRule="auto"/>
+        <w:ind w:firstLine="0" w:start="0"/>
+        <w:jc w:val="both"/>
+      </w:pPr>
+      <w:r>
+        <w:rPr>
+          <w:rFonts w:ascii="Open Sans" w:hAnsi="Open Sans" w:cs="Open Sans" w:eastAsia="Open Sans"/>
+          <w:color w:val="000000"/>
+          <w:sz w:val="24"/>
+          <w:szCs w:val="24"/>
+        </w:rPr>
+        <w:t xml:space="preserve">Aproximadamente metade do tempo e da memória, confirmando a seção 3.2.</w:t>
+      </w:r>
+    </w:p>
+    <w:p>
+      <w:pPr>
+        <w:spacing w:after="120" w:before="120" w:line="276" w:lineRule="auto"/>
+        <w:ind w:firstLine="0" w:start="0"/>
+        <w:jc w:val="both"/>
+      </w:pPr>
+      <w:r>
+        <w:rPr>
+          <w:rFonts w:ascii="Open Sans" w:hAnsi="Open Sans" w:cs="Open Sans" w:eastAsia="Open Sans"/>
+          <w:b/>
+          <w:bCs/>
+          <w:color w:val="000000"/>
+          <w:sz w:val="24"/>
+          <w:szCs w:val="24"/>
+        </w:rPr>
+        <w:t xml:space="preserve">Cache do ranking (Redis).</w:t>
+      </w:r>
+      <w:r>
+        <w:rPr>
+          <w:rFonts w:ascii="Open Sans" w:hAnsi="Open Sans" w:cs="Open Sans" w:eastAsia="Open Sans"/>
+          <w:color w:val="000000"/>
+          <w:sz w:val="24"/>
+          <w:szCs w:val="24"/>
+        </w:rPr>
+        <w:t xml:space="preserve"> </w:t>
+      </w:r>
+      <w:r>
+        <w:rPr>
+          <w:rFonts w:ascii="Consolas" w:hAnsi="Consolas" w:cs="Consolas" w:eastAsia="Consolas"/>
+          <w:color w:val="000000"/>
+          <w:shd w:val="clear" w:fill="F2F2F2"/>
+          <w:sz w:val="24"/>
+          <w:szCs w:val="24"/>
+        </w:rPr>
+        <w:t xml:space="preserve">ObterTop10Async()</w:t>
+      </w:r>
+      <w:r>
+        <w:rPr>
+          <w:rFonts w:ascii="Open Sans" w:hAnsi="Open Sans" w:cs="Open Sans" w:eastAsia="Open Sans"/>
+          <w:color w:val="000000"/>
+          <w:sz w:val="24"/>
+          <w:szCs w:val="24"/>
+        </w:rPr>
+        <w:t xml:space="preserve"> chamado duas vezes seguidas:</w:t>
+      </w:r>
+    </w:p>
+    <w:tbl>
+      <w:tblPr>
+        <w:tblW w:w="5000" w:type="pct"/>
+        <w:tblBorders>
+          <w:top w:val="single" w:sz="4" w:space="0" w:color="D8DEE4"/>
+          <w:left w:val="single" w:sz="4" w:space="0" w:color="D8DEE4"/>
+          <w:bottom w:val="single" w:sz="4" w:space="0" w:color="D8DEE4"/>
+          <w:right w:val="single" w:sz="4" w:space="0" w:color="D8DEE4"/>
+        </w:tblBorders>
+        <w:tblCellMar>
+          <w:top w:w="80" w:type="dxa"/>
+          <w:left w:w="140" w:type="dxa"/>
+          <w:bottom w:w="80" w:type="dxa"/>
+          <w:right w:w="140" w:type="dxa"/>
+        </w:tblCellMar>
+      </w:tblPr>
+      <w:tr>
+        <w:tc>
+          <w:tcPr>
+            <w:tcW w:w="5000" w:type="pct"/>
+            <w:shd w:val="clear" w:fill="F6F8FA"/>
+          </w:tcPr>
+          <w:p>
+            <w:pPr>
+              <w:spacing w:after="0" w:before="40" w:line="240" w:lineRule="auto"/>
+              <w:ind w:firstLine="0" w:start="0"/>
+              <w:jc w:val="start"/>
+            </w:pPr>
+            <w:r>
+              <w:rPr>
+                <w:rFonts w:ascii="Consolas" w:hAnsi="Consolas" w:cs="Consolas" w:eastAsia="Consolas"/>
+                <w:color w:val="1F2328"/>
+                <w:sz w:val="18"/>
+                <w:szCs w:val="18"/>
+              </w:rPr>
+              <w:t xml:space="preserve">1a chamada (reconstroi do banco): 797 ms</w:t>
+            </w:r>
+          </w:p>
+          <w:p>
+            <w:pPr>
+              <w:spacing w:after="0" w:before="0" w:line="240" w:lineRule="auto"/>
+              <w:ind w:firstLine="0" w:start="0"/>
+              <w:jc w:val="start"/>
+            </w:pPr>
+            <w:r>
+              <w:rPr>
+                <w:rFonts w:ascii="Consolas" w:hAnsi="Consolas" w:cs="Consolas" w:eastAsia="Consolas"/>
+                <w:color w:val="1F2328"/>
+                <w:sz w:val="18"/>
+                <w:szCs w:val="18"/>
+              </w:rPr>
+              <w:t xml:space="preserve">2a chamada (cache hit):             5 ms</w:t>
+            </w:r>
+          </w:p>
+          <w:p>
+            <w:pPr>
+              <w:spacing w:after="0" w:before="0" w:line="240" w:lineRule="auto"/>
+              <w:ind w:firstLine="0" w:start="0"/>
+              <w:jc w:val="start"/>
+            </w:pPr>
+            <w:r>
+              <w:rPr>
+                <w:rFonts w:ascii="Consolas" w:hAnsi="Consolas" w:cs="Consolas" w:eastAsia="Consolas"/>
+                <w:color w:val="1F2328"/>
+                <w:sz w:val="18"/>
+                <w:szCs w:val="18"/>
+              </w:rPr>
+              <w:t xml:space="preserve">TTL da chave logo apos gravar:  119,988 s (config: 120 s)</w:t>
+            </w:r>
+          </w:p>
+        </w:tc>
+      </w:tr>
+    </w:tbl>
+    <w:p>
+      <w:pPr>
+        <w:spacing w:after="60" w:before="0" w:line="276" w:lineRule="auto"/>
+        <w:ind w:firstLine="0" w:start="0"/>
+        <w:jc w:val="start"/>
+      </w:pPr>
+    </w:p>
+    <w:p>
+      <w:pPr>
+        <w:spacing w:after="120" w:before="120" w:line="276" w:lineRule="auto"/>
+        <w:ind w:firstLine="0" w:start="0"/>
+        <w:jc w:val="both"/>
+      </w:pPr>
+      <w:r>
+        <w:rPr>
+          <w:rFonts w:ascii="Open Sans" w:hAnsi="Open Sans" w:cs="Open Sans" w:eastAsia="Open Sans"/>
+          <w:b/>
+          <w:bCs/>
+          <w:color w:val="000000"/>
+          <w:sz w:val="24"/>
+          <w:szCs w:val="24"/>
+        </w:rPr>
+        <w:t xml:space="preserve">Sorted Set e revogação de JWT.</w:t>
+      </w:r>
+      <w:r>
+        <w:rPr>
+          <w:rFonts w:ascii="Open Sans" w:hAnsi="Open Sans" w:cs="Open Sans" w:eastAsia="Open Sans"/>
+          <w:color w:val="000000"/>
+          <w:sz w:val="24"/>
+          <w:szCs w:val="24"/>
+        </w:rPr>
+        <w:t xml:space="preserve"> Testados com três jogadores de pontuações distintas: a posição via </w:t>
+      </w:r>
+      <w:r>
+        <w:rPr>
+          <w:rFonts w:ascii="Consolas" w:hAnsi="Consolas" w:cs="Consolas" w:eastAsia="Consolas"/>
+          <w:color w:val="000000"/>
+          <w:shd w:val="clear" w:fill="F2F2F2"/>
+          <w:sz w:val="24"/>
+          <w:szCs w:val="24"/>
+        </w:rPr>
+        <w:t xml:space="preserve">ZREVRANK</w:t>
+      </w:r>
+      <w:r>
+        <w:rPr>
+          <w:rFonts w:ascii="Open Sans" w:hAnsi="Open Sans" w:cs="Open Sans" w:eastAsia="Open Sans"/>
+          <w:color w:val="000000"/>
+          <w:sz w:val="24"/>
+          <w:szCs w:val="24"/>
+        </w:rPr>
+        <w:t xml:space="preserve"> bateu com a ordem esperada (1ª, 2ª, 3ª) e um jogador sem pontuação retornou posição nula, como a seção 4.3 previa. A revogação de token (seção 4.7) foi testada com um TTL curto de 3s: o token aparece como revogado imediatamente após </w:t>
+      </w:r>
+      <w:r>
+        <w:rPr>
+          <w:rFonts w:ascii="Consolas" w:hAnsi="Consolas" w:cs="Consolas" w:eastAsia="Consolas"/>
+          <w:color w:val="000000"/>
+          <w:shd w:val="clear" w:fill="F2F2F2"/>
+          <w:sz w:val="24"/>
+          <w:szCs w:val="24"/>
+        </w:rPr>
+        <w:t xml:space="preserve">RevogarTokenAsync</w:t>
+      </w:r>
+      <w:r>
+        <w:rPr>
+          <w:rFonts w:ascii="Open Sans" w:hAnsi="Open Sans" w:cs="Open Sans" w:eastAsia="Open Sans"/>
+          <w:color w:val="000000"/>
+          <w:sz w:val="24"/>
+          <w:szCs w:val="24"/>
+        </w:rPr>
+        <w:t xml:space="preserve"> e deixa de aparecer como revogado assim que o TTL expira — a chave some sozinha, sem acumular. Um token já expirado no momento da revogação não chega a gravar chave no Redis.</w:t>
+      </w:r>
+    </w:p>
+    <w:p>
+      <w:pPr>
+        <w:spacing w:after="120" w:before="120" w:line="276" w:lineRule="auto"/>
+        <w:ind w:firstLine="0" w:start="0"/>
+        <w:jc w:val="both"/>
+      </w:pPr>
+      <w:r>
+        <w:rPr>
+          <w:rFonts w:ascii="Open Sans" w:hAnsi="Open Sans" w:cs="Open Sans" w:eastAsia="Open Sans"/>
+          <w:b/>
+          <w:bCs/>
+          <w:color w:val="000000"/>
+          <w:sz w:val="24"/>
+          <w:szCs w:val="24"/>
+        </w:rPr>
+        <w:t xml:space="preserve">Paginação.</w:t>
+      </w:r>
+      <w:r>
+        <w:rPr>
+          <w:rFonts w:ascii="Open Sans" w:hAnsi="Open Sans" w:cs="Open Sans" w:eastAsia="Open Sans"/>
+          <w:color w:val="000000"/>
+          <w:sz w:val="24"/>
+          <w:szCs w:val="24"/>
+        </w:rPr>
+        <w:t xml:space="preserve"> Consultada a página 1 (</w:t>
+      </w:r>
+      <w:r>
+        <w:rPr>
+          <w:rFonts w:ascii="Consolas" w:hAnsi="Consolas" w:cs="Consolas" w:eastAsia="Consolas"/>
+          <w:color w:val="000000"/>
+          <w:shd w:val="clear" w:fill="F2F2F2"/>
+          <w:sz w:val="24"/>
+          <w:szCs w:val="24"/>
+        </w:rPr>
+        <w:t xml:space="preserve">OFFSET 0</w:t>
+      </w:r>
+      <w:r>
+        <w:rPr>
+          <w:rFonts w:ascii="Open Sans" w:hAnsi="Open Sans" w:cs="Open Sans" w:eastAsia="Open Sans"/>
+          <w:color w:val="000000"/>
+          <w:sz w:val="24"/>
+          <w:szCs w:val="24"/>
+        </w:rPr>
+        <w:t xml:space="preserve">) e a página 2 (</w:t>
+      </w:r>
+      <w:r>
+        <w:rPr>
+          <w:rFonts w:ascii="Consolas" w:hAnsi="Consolas" w:cs="Consolas" w:eastAsia="Consolas"/>
+          <w:color w:val="000000"/>
+          <w:shd w:val="clear" w:fill="F2F2F2"/>
+          <w:sz w:val="24"/>
+          <w:szCs w:val="24"/>
+        </w:rPr>
+        <w:t xml:space="preserve">OFFSET 20</w:t>
+      </w:r>
+      <w:r>
+        <w:rPr>
+          <w:rFonts w:ascii="Open Sans" w:hAnsi="Open Sans" w:cs="Open Sans" w:eastAsia="Open Sans"/>
+          <w:color w:val="000000"/>
+          <w:sz w:val="24"/>
+          <w:szCs w:val="24"/>
+        </w:rPr>
+        <w:t xml:space="preserve">) da mesma ordenação </w:t>
+      </w:r>
+      <w:r>
+        <w:rPr>
+          <w:rFonts w:ascii="Consolas" w:hAnsi="Consolas" w:cs="Consolas" w:eastAsia="Consolas"/>
+          <w:color w:val="000000"/>
+          <w:shd w:val="clear" w:fill="F2F2F2"/>
+          <w:sz w:val="24"/>
+          <w:szCs w:val="24"/>
+        </w:rPr>
+        <w:t xml:space="preserve">PontuacaoTotal DESC, Id</w:t>
+      </w:r>
+      <w:r>
+        <w:rPr>
+          <w:rFonts w:ascii="Open Sans" w:hAnsi="Open Sans" w:cs="Open Sans" w:eastAsia="Open Sans"/>
+          <w:color w:val="000000"/>
+          <w:sz w:val="24"/>
+          <w:szCs w:val="24"/>
+        </w:rPr>
+        <w:t xml:space="preserve">: interseção de </w:t>
+      </w:r>
+      <w:r>
+        <w:rPr>
+          <w:rFonts w:ascii="Consolas" w:hAnsi="Consolas" w:cs="Consolas" w:eastAsia="Consolas"/>
+          <w:color w:val="000000"/>
+          <w:shd w:val="clear" w:fill="F2F2F2"/>
+          <w:sz w:val="24"/>
+          <w:szCs w:val="24"/>
+        </w:rPr>
+        <w:t xml:space="preserve">Id</w:t>
+      </w:r>
+      <w:r>
+        <w:rPr>
+          <w:rFonts w:ascii="Open Sans" w:hAnsi="Open Sans" w:cs="Open Sans" w:eastAsia="Open Sans"/>
+          <w:color w:val="000000"/>
+          <w:sz w:val="24"/>
+          <w:szCs w:val="24"/>
+        </w:rPr>
+        <w:t xml:space="preserve"> entre as duas páginas é zero, ou seja, o desempate por </w:t>
+      </w:r>
+      <w:r>
+        <w:rPr>
+          <w:rFonts w:ascii="Consolas" w:hAnsi="Consolas" w:cs="Consolas" w:eastAsia="Consolas"/>
+          <w:color w:val="000000"/>
+          <w:shd w:val="clear" w:fill="F2F2F2"/>
+          <w:sz w:val="24"/>
+          <w:szCs w:val="24"/>
+        </w:rPr>
+        <w:t xml:space="preserve">Id</w:t>
+      </w:r>
+      <w:r>
+        <w:rPr>
+          <w:rFonts w:ascii="Open Sans" w:hAnsi="Open Sans" w:cs="Open Sans" w:eastAsia="Open Sans"/>
+          <w:color w:val="000000"/>
+          <w:sz w:val="24"/>
+          <w:szCs w:val="24"/>
+        </w:rPr>
+        <w:t xml:space="preserve"> da seção 3.3 realmente elimina a duplicação/omissão de jogadores.</w:t>
+      </w:r>
+    </w:p>
+    <w:p>
+      <w:pPr>
+        <w:spacing w:after="120" w:before="240" w:line="276" w:lineRule="auto"/>
+        <w:ind w:firstLine="0" w:start="0"/>
+        <w:jc w:val="start"/>
+      </w:pPr>
+      <w:r>
+        <w:rPr>
+          <w:rFonts w:ascii="Open Sans" w:hAnsi="Open Sans" w:cs="Open Sans" w:eastAsia="Open Sans"/>
+          <w:b/>
+          <w:bCs/>
+          <w:color w:val="000000"/>
+          <w:sz w:val="26"/>
+          <w:szCs w:val="26"/>
+        </w:rPr>
+        <w:t xml:space="preserve">6.2. Bugs encontrados ao testar de verdade (e já corrigidos na branch)</w:t>
+      </w:r>
+    </w:p>
+    <w:p>
+      <w:pPr>
+        <w:spacing w:after="120" w:before="120" w:line="276" w:lineRule="auto"/>
+        <w:ind w:firstLine="0" w:start="0"/>
+        <w:jc w:val="both"/>
+      </w:pPr>
+      <w:r>
+        <w:rPr>
+          <w:rFonts w:ascii="Open Sans" w:hAnsi="Open Sans" w:cs="Open Sans" w:eastAsia="Open Sans"/>
+          <w:color w:val="000000"/>
+          <w:sz w:val="24"/>
+          <w:szCs w:val="24"/>
+        </w:rPr>
+        <w:t xml:space="preserve">Testar contra Postgres e Redis reais — em vez de só ler o código — expôs dois problemas que a leitura não pegaria:</w:t>
+      </w:r>
+    </w:p>
+    <w:p>
+      <w:pPr>
+        <w:spacing w:after="120" w:before="120" w:line="276" w:lineRule="auto"/>
+        <w:ind w:firstLine="0" w:start="0"/>
+        <w:jc w:val="both"/>
+      </w:pPr>
+      <w:r>
+        <w:rPr>
+          <w:rFonts w:ascii="Open Sans" w:hAnsi="Open Sans" w:cs="Open Sans" w:eastAsia="Open Sans"/>
+          <w:b/>
+          <w:bCs/>
+          <w:color w:val="000000"/>
+          <w:sz w:val="24"/>
+          <w:szCs w:val="24"/>
+        </w:rPr>
+        <w:t xml:space="preserve">A réplica de leitura nunca subia.</w:t>
+      </w:r>
+      <w:r>
+        <w:rPr>
+          <w:rFonts w:ascii="Open Sans" w:hAnsi="Open Sans" w:cs="Open Sans" w:eastAsia="Open Sans"/>
+          <w:color w:val="000000"/>
+          <w:sz w:val="24"/>
+          <w:szCs w:val="24"/>
+        </w:rPr>
+        <w:t xml:space="preserve"> O </w:t>
+      </w:r>
+      <w:r>
+        <w:rPr>
+          <w:rFonts w:ascii="Consolas" w:hAnsi="Consolas" w:cs="Consolas" w:eastAsia="Consolas"/>
+          <w:color w:val="000000"/>
+          <w:shd w:val="clear" w:fill="F2F2F2"/>
+          <w:sz w:val="24"/>
+          <w:szCs w:val="24"/>
+        </w:rPr>
+        <w:t xml:space="preserve">docker-compose.yml</w:t>
+      </w:r>
+      <w:r>
+        <w:rPr>
+          <w:rFonts w:ascii="Open Sans" w:hAnsi="Open Sans" w:cs="Open Sans" w:eastAsia="Open Sans"/>
+          <w:color w:val="000000"/>
+          <w:sz w:val="24"/>
+          <w:szCs w:val="24"/>
+        </w:rPr>
+        <w:t xml:space="preserve"> da seção 5.2 tinha três defeitos empilhados, todos silenciosos até alguém rodar </w:t>
+      </w:r>
+      <w:r>
+        <w:rPr>
+          <w:rFonts w:ascii="Consolas" w:hAnsi="Consolas" w:cs="Consolas" w:eastAsia="Consolas"/>
+          <w:color w:val="000000"/>
+          <w:shd w:val="clear" w:fill="F2F2F2"/>
+          <w:sz w:val="24"/>
+          <w:szCs w:val="24"/>
+        </w:rPr>
+        <w:t xml:space="preserve">docker compose up</w:t>
+      </w:r>
+      <w:r>
+        <w:rPr>
+          <w:rFonts w:ascii="Open Sans" w:hAnsi="Open Sans" w:cs="Open Sans" w:eastAsia="Open Sans"/>
+          <w:color w:val="000000"/>
+          <w:sz w:val="24"/>
+          <w:szCs w:val="24"/>
+        </w:rPr>
+        <w:t xml:space="preserve"> de verdade:</w:t>
+      </w:r>
+    </w:p>
+    <w:p>
+      <w:pPr>
+        <w:spacing w:after="40" w:before="40" w:line="276" w:lineRule="auto"/>
+        <w:ind w:firstLine="0" w:start="360"/>
+        <w:jc w:val="start"/>
+      </w:pPr>
+      <w:r>
+        <w:rPr>
+          <w:rFonts w:ascii="Open Sans" w:hAnsi="Open Sans" w:cs="Open Sans" w:eastAsia="Open Sans"/>
+          <w:color w:val="000000"/>
+          <w:sz w:val="24"/>
+          <w:szCs w:val="24"/>
+        </w:rPr>
+        <w:t xml:space="preserve">1. </w:t>
+      </w:r>
+      <w:r>
+        <w:rPr>
+          <w:rFonts w:ascii="Open Sans" w:hAnsi="Open Sans" w:cs="Open Sans" w:eastAsia="Open Sans"/>
+          <w:color w:val="000000"/>
+          <w:sz w:val="24"/>
+          <w:szCs w:val="24"/>
+        </w:rPr>
+        <w:t xml:space="preserve">O bloco </w:t>
+      </w:r>
+      <w:r>
+        <w:rPr>
+          <w:rFonts w:ascii="Consolas" w:hAnsi="Consolas" w:cs="Consolas" w:eastAsia="Consolas"/>
+          <w:color w:val="000000"/>
+          <w:shd w:val="clear" w:fill="F2F2F2"/>
+          <w:sz w:val="24"/>
+          <w:szCs w:val="24"/>
+        </w:rPr>
+        <w:t xml:space="preserve">command: &gt; bash -c "..."</w:t>
+      </w:r>
+      <w:r>
+        <w:rPr>
+          <w:rFonts w:ascii="Open Sans" w:hAnsi="Open Sans" w:cs="Open Sans" w:eastAsia="Open Sans"/>
+          <w:color w:val="000000"/>
+          <w:sz w:val="24"/>
+          <w:szCs w:val="24"/>
+        </w:rPr>
+        <w:t xml:space="preserve"> é um </w:t>
+      </w:r>
+      <w:r>
+        <w:rPr>
+          <w:rFonts w:ascii="Open Sans" w:hAnsi="Open Sans" w:cs="Open Sans" w:eastAsia="Open Sans"/>
+          <w:i/>
+          <w:iCs/>
+          <w:color w:val="000000"/>
+          <w:sz w:val="24"/>
+          <w:szCs w:val="24"/>
+        </w:rPr>
+        <w:t xml:space="preserve">scalar</w:t>
+      </w:r>
+      <w:r>
+        <w:rPr>
+          <w:rFonts w:ascii="Open Sans" w:hAnsi="Open Sans" w:cs="Open Sans" w:eastAsia="Open Sans"/>
+          <w:color w:val="000000"/>
+          <w:sz w:val="24"/>
+          <w:szCs w:val="24"/>
+        </w:rPr>
+        <w:t xml:space="preserve"> YAML dobrado; a linha de continuação do</w:t>
+      </w:r>
+    </w:p>
+    <w:p>
+      <w:pPr>
+        <w:spacing w:after="120" w:before="120" w:line="276" w:lineRule="auto"/>
+        <w:ind w:firstLine="0" w:start="0"/>
+        <w:jc w:val="both"/>
+      </w:pPr>
+      <w:r>
+        <w:rPr>
+          <w:rFonts w:ascii="Open Sans" w:hAnsi="Open Sans" w:cs="Open Sans" w:eastAsia="Open Sans"/>
+          <w:color w:val="000000"/>
+          <w:sz w:val="24"/>
+          <w:szCs w:val="24"/>
+        </w:rPr>
+        <w:t xml:space="preserve">   </w:t>
+      </w:r>
+      <w:r>
+        <w:rPr>
+          <w:rFonts w:ascii="Consolas" w:hAnsi="Consolas" w:cs="Consolas" w:eastAsia="Consolas"/>
+          <w:color w:val="000000"/>
+          <w:shd w:val="clear" w:fill="F2F2F2"/>
+          <w:sz w:val="24"/>
+          <w:szCs w:val="24"/>
+        </w:rPr>
+        <w:t xml:space="preserve">pg_basebackup</w:t>
+      </w:r>
+      <w:r>
+        <w:rPr>
+          <w:rFonts w:ascii="Open Sans" w:hAnsi="Open Sans" w:cs="Open Sans" w:eastAsia="Open Sans"/>
+          <w:color w:val="000000"/>
+          <w:sz w:val="24"/>
+          <w:szCs w:val="24"/>
+        </w:rPr>
+        <w:t xml:space="preserve"> (</w:t>
+      </w:r>
+      <w:r>
+        <w:rPr>
+          <w:rFonts w:ascii="Consolas" w:hAnsi="Consolas" w:cs="Consolas" w:eastAsia="Consolas"/>
+          <w:color w:val="000000"/>
+          <w:shd w:val="clear" w:fill="F2F2F2"/>
+          <w:sz w:val="24"/>
+          <w:szCs w:val="24"/>
+        </w:rPr>
+        <w:t xml:space="preserve">-D /var/lib/postgresql/data ...</w:t>
+      </w:r>
+      <w:r>
+        <w:rPr>
+          <w:rFonts w:ascii="Open Sans" w:hAnsi="Open Sans" w:cs="Open Sans" w:eastAsia="Open Sans"/>
+          <w:color w:val="000000"/>
+          <w:sz w:val="24"/>
+          <w:szCs w:val="24"/>
+        </w:rPr>
+        <w:t xml:space="preserve">) ficava indentada demais e o YAML a    preservava como uma linha separada, virando um comando </w:t>
+      </w:r>
+      <w:r>
+        <w:rPr>
+          <w:rFonts w:ascii="Consolas" w:hAnsi="Consolas" w:cs="Consolas" w:eastAsia="Consolas"/>
+          <w:color w:val="000000"/>
+          <w:shd w:val="clear" w:fill="F2F2F2"/>
+          <w:sz w:val="24"/>
+          <w:szCs w:val="24"/>
+        </w:rPr>
+        <w:t xml:space="preserve">-D</w:t>
+      </w:r>
+      <w:r>
+        <w:rPr>
+          <w:rFonts w:ascii="Open Sans" w:hAnsi="Open Sans" w:cs="Open Sans" w:eastAsia="Open Sans"/>
+          <w:color w:val="000000"/>
+          <w:sz w:val="24"/>
+          <w:szCs w:val="24"/>
+        </w:rPr>
+        <w:t xml:space="preserve"> inexistente no bash.</w:t>
+      </w:r>
+    </w:p>
+    <w:p>
+      <w:pPr>
+        <w:spacing w:after="40" w:before="40" w:line="276" w:lineRule="auto"/>
+        <w:ind w:firstLine="0" w:start="360"/>
+        <w:jc w:val="start"/>
+      </w:pPr>
+      <w:r>
+        <w:rPr>
+          <w:rFonts w:ascii="Open Sans" w:hAnsi="Open Sans" w:cs="Open Sans" w:eastAsia="Open Sans"/>
+          <w:color w:val="000000"/>
+          <w:sz w:val="24"/>
+          <w:szCs w:val="24"/>
+        </w:rPr>
+        <w:t xml:space="preserve">2. </w:t>
+      </w:r>
+      <w:r>
+        <w:rPr>
+          <w:rFonts w:ascii="Open Sans" w:hAnsi="Open Sans" w:cs="Open Sans" w:eastAsia="Open Sans"/>
+          <w:color w:val="000000"/>
+          <w:sz w:val="24"/>
+          <w:szCs w:val="24"/>
+        </w:rPr>
+        <w:t xml:space="preserve">O </w:t>
+      </w:r>
+      <w:r>
+        <w:rPr>
+          <w:rFonts w:ascii="Consolas" w:hAnsi="Consolas" w:cs="Consolas" w:eastAsia="Consolas"/>
+          <w:color w:val="000000"/>
+          <w:shd w:val="clear" w:fill="F2F2F2"/>
+          <w:sz w:val="24"/>
+          <w:szCs w:val="24"/>
+        </w:rPr>
+        <w:t xml:space="preserve">pg_hba.conf</w:t>
+      </w:r>
+      <w:r>
+        <w:rPr>
+          <w:rFonts w:ascii="Open Sans" w:hAnsi="Open Sans" w:cs="Open Sans" w:eastAsia="Open Sans"/>
+          <w:color w:val="000000"/>
+          <w:sz w:val="24"/>
+          <w:szCs w:val="24"/>
+        </w:rPr>
+        <w:t xml:space="preserve"> gerado pelo </w:t>
+      </w:r>
+      <w:r>
+        <w:rPr>
+          <w:rFonts w:ascii="Consolas" w:hAnsi="Consolas" w:cs="Consolas" w:eastAsia="Consolas"/>
+          <w:color w:val="000000"/>
+          <w:shd w:val="clear" w:fill="F2F2F2"/>
+          <w:sz w:val="24"/>
+          <w:szCs w:val="24"/>
+        </w:rPr>
+        <w:t xml:space="preserve">initdb</w:t>
+      </w:r>
+      <w:r>
+        <w:rPr>
+          <w:rFonts w:ascii="Open Sans" w:hAnsi="Open Sans" w:cs="Open Sans" w:eastAsia="Open Sans"/>
+          <w:color w:val="000000"/>
+          <w:sz w:val="24"/>
+          <w:szCs w:val="24"/>
+        </w:rPr>
+        <w:t xml:space="preserve"> libera </w:t>
+      </w:r>
+      <w:r>
+        <w:rPr>
+          <w:rFonts w:ascii="Consolas" w:hAnsi="Consolas" w:cs="Consolas" w:eastAsia="Consolas"/>
+          <w:color w:val="000000"/>
+          <w:shd w:val="clear" w:fill="F2F2F2"/>
+          <w:sz w:val="24"/>
+          <w:szCs w:val="24"/>
+        </w:rPr>
+        <w:t xml:space="preserve">host all all all</w:t>
+      </w:r>
+      <w:r>
+        <w:rPr>
+          <w:rFonts w:ascii="Open Sans" w:hAnsi="Open Sans" w:cs="Open Sans" w:eastAsia="Open Sans"/>
+          <w:color w:val="000000"/>
+          <w:sz w:val="24"/>
+          <w:szCs w:val="24"/>
+        </w:rPr>
+        <w:t xml:space="preserve">, mas isso </w:t>
+      </w:r>
+      <w:r>
+        <w:rPr>
+          <w:rFonts w:ascii="Open Sans" w:hAnsi="Open Sans" w:cs="Open Sans" w:eastAsia="Open Sans"/>
+          <w:b/>
+          <w:bCs/>
+          <w:color w:val="000000"/>
+          <w:sz w:val="24"/>
+          <w:szCs w:val="24"/>
+        </w:rPr>
+        <w:t xml:space="preserve">não cobre</w:t>
+      </w:r>
+      <w:r>
+        <w:rPr>
+          <w:rFonts w:ascii="Open Sans" w:hAnsi="Open Sans" w:cs="Open Sans" w:eastAsia="Open Sans"/>
+          <w:color w:val="000000"/>
+          <w:sz w:val="24"/>
+          <w:szCs w:val="24"/>
+        </w:rPr>
+        <w:t xml:space="preserve"> a</w:t>
+      </w:r>
+    </w:p>
+    <w:p>
+      <w:pPr>
+        <w:spacing w:after="120" w:before="120" w:line="276" w:lineRule="auto"/>
+        <w:ind w:firstLine="0" w:start="0"/>
+        <w:jc w:val="both"/>
+      </w:pPr>
+      <w:r>
+        <w:rPr>
+          <w:rFonts w:ascii="Open Sans" w:hAnsi="Open Sans" w:cs="Open Sans" w:eastAsia="Open Sans"/>
+          <w:color w:val="000000"/>
+          <w:sz w:val="24"/>
+          <w:szCs w:val="24"/>
+        </w:rPr>
+        <w:t xml:space="preserve">   pseudo-database </w:t>
+      </w:r>
+      <w:r>
+        <w:rPr>
+          <w:rFonts w:ascii="Consolas" w:hAnsi="Consolas" w:cs="Consolas" w:eastAsia="Consolas"/>
+          <w:color w:val="000000"/>
+          <w:shd w:val="clear" w:fill="F2F2F2"/>
+          <w:sz w:val="24"/>
+          <w:szCs w:val="24"/>
+        </w:rPr>
+        <w:t xml:space="preserve">replication</w:t>
+      </w:r>
+      <w:r>
+        <w:rPr>
+          <w:rFonts w:ascii="Open Sans" w:hAnsi="Open Sans" w:cs="Open Sans" w:eastAsia="Open Sans"/>
+          <w:color w:val="000000"/>
+          <w:sz w:val="24"/>
+          <w:szCs w:val="24"/>
+        </w:rPr>
+        <w:t xml:space="preserve"> — faltava uma entrada dedicada, e a réplica era rejeitada com    </w:t>
+      </w:r>
+      <w:r>
+        <w:rPr>
+          <w:rFonts w:ascii="Consolas" w:hAnsi="Consolas" w:cs="Consolas" w:eastAsia="Consolas"/>
+          <w:color w:val="000000"/>
+          <w:shd w:val="clear" w:fill="F2F2F2"/>
+          <w:sz w:val="24"/>
+          <w:szCs w:val="24"/>
+        </w:rPr>
+        <w:t xml:space="preserve">no pg_hba.conf entry for replication connection</w:t>
+      </w:r>
+      <w:r>
+        <w:rPr>
+          <w:rFonts w:ascii="Open Sans" w:hAnsi="Open Sans" w:cs="Open Sans" w:eastAsia="Open Sans"/>
+          <w:color w:val="000000"/>
+          <w:sz w:val="24"/>
+          <w:szCs w:val="24"/>
+        </w:rPr>
+        <w:t xml:space="preserve">.</w:t>
+      </w:r>
+    </w:p>
+    <w:p>
+      <w:pPr>
+        <w:spacing w:after="40" w:before="40" w:line="276" w:lineRule="auto"/>
+        <w:ind w:firstLine="0" w:start="360"/>
+        <w:jc w:val="start"/>
+      </w:pPr>
+      <w:r>
+        <w:rPr>
+          <w:rFonts w:ascii="Open Sans" w:hAnsi="Open Sans" w:cs="Open Sans" w:eastAsia="Open Sans"/>
+          <w:color w:val="000000"/>
+          <w:sz w:val="24"/>
+          <w:szCs w:val="24"/>
+        </w:rPr>
+        <w:t xml:space="preserve">3. </w:t>
+      </w:r>
+      <w:r>
+        <w:rPr>
+          <w:rFonts w:ascii="Open Sans" w:hAnsi="Open Sans" w:cs="Open Sans" w:eastAsia="Open Sans"/>
+          <w:color w:val="000000"/>
+          <w:sz w:val="24"/>
+          <w:szCs w:val="24"/>
+        </w:rPr>
+        <w:t xml:space="preserve">Depois de corrigir os dois itens acima, o processo final (</w:t>
+      </w:r>
+      <w:r>
+        <w:rPr>
+          <w:rFonts w:ascii="Consolas" w:hAnsi="Consolas" w:cs="Consolas" w:eastAsia="Consolas"/>
+          <w:color w:val="000000"/>
+          <w:shd w:val="clear" w:fill="F2F2F2"/>
+          <w:sz w:val="24"/>
+          <w:szCs w:val="24"/>
+        </w:rPr>
+        <w:t xml:space="preserve">exec postgres ...</w:t>
+      </w:r>
+      <w:r>
+        <w:rPr>
+          <w:rFonts w:ascii="Open Sans" w:hAnsi="Open Sans" w:cs="Open Sans" w:eastAsia="Open Sans"/>
+          <w:color w:val="000000"/>
+          <w:sz w:val="24"/>
+          <w:szCs w:val="24"/>
+        </w:rPr>
+        <w:t xml:space="preserve">) ainda falhava</w:t>
+      </w:r>
+    </w:p>
+    <w:p>
+      <w:pPr>
+        <w:spacing w:after="120" w:before="120" w:line="276" w:lineRule="auto"/>
+        <w:ind w:firstLine="0" w:start="0"/>
+        <w:jc w:val="both"/>
+      </w:pPr>
+      <w:r>
+        <w:rPr>
+          <w:rFonts w:ascii="Open Sans" w:hAnsi="Open Sans" w:cs="Open Sans" w:eastAsia="Open Sans"/>
+          <w:color w:val="000000"/>
+          <w:sz w:val="24"/>
+          <w:szCs w:val="24"/>
+        </w:rPr>
+        <w:t xml:space="preserve">   com </w:t>
+      </w:r>
+      <w:r>
+        <w:rPr>
+          <w:rFonts w:ascii="Consolas" w:hAnsi="Consolas" w:cs="Consolas" w:eastAsia="Consolas"/>
+          <w:color w:val="000000"/>
+          <w:shd w:val="clear" w:fill="F2F2F2"/>
+          <w:sz w:val="24"/>
+          <w:szCs w:val="24"/>
+        </w:rPr>
+        <w:t xml:space="preserve">"root" execution ... is not permitted</w:t>
+      </w:r>
+      <w:r>
+        <w:rPr>
+          <w:rFonts w:ascii="Open Sans" w:hAnsi="Open Sans" w:cs="Open Sans" w:eastAsia="Open Sans"/>
+          <w:color w:val="000000"/>
+          <w:sz w:val="24"/>
+          <w:szCs w:val="24"/>
+        </w:rPr>
+        <w:t xml:space="preserve">: o </w:t>
+      </w:r>
+      <w:r>
+        <w:rPr>
+          <w:rFonts w:ascii="Consolas" w:hAnsi="Consolas" w:cs="Consolas" w:eastAsia="Consolas"/>
+          <w:color w:val="000000"/>
+          <w:shd w:val="clear" w:fill="F2F2F2"/>
+          <w:sz w:val="24"/>
+          <w:szCs w:val="24"/>
+        </w:rPr>
+        <w:t xml:space="preserve">bash -c</w:t>
+      </w:r>
+      <w:r>
+        <w:rPr>
+          <w:rFonts w:ascii="Open Sans" w:hAnsi="Open Sans" w:cs="Open Sans" w:eastAsia="Open Sans"/>
+          <w:color w:val="000000"/>
+          <w:sz w:val="24"/>
+          <w:szCs w:val="24"/>
+        </w:rPr>
+        <w:t xml:space="preserve"> do </w:t>
+      </w:r>
+      <w:r>
+        <w:rPr>
+          <w:rFonts w:ascii="Consolas" w:hAnsi="Consolas" w:cs="Consolas" w:eastAsia="Consolas"/>
+          <w:color w:val="000000"/>
+          <w:shd w:val="clear" w:fill="F2F2F2"/>
+          <w:sz w:val="24"/>
+          <w:szCs w:val="24"/>
+        </w:rPr>
+        <w:t xml:space="preserve">command:</w:t>
+      </w:r>
+      <w:r>
+        <w:rPr>
+          <w:rFonts w:ascii="Open Sans" w:hAnsi="Open Sans" w:cs="Open Sans" w:eastAsia="Open Sans"/>
+          <w:color w:val="000000"/>
+          <w:sz w:val="24"/>
+          <w:szCs w:val="24"/>
+        </w:rPr>
+        <w:t xml:space="preserve"> roda como root e pula    a troca de usuário que o entrypoint oficial da imagem faz sozinho — precisa de    </w:t>
+      </w:r>
+      <w:r>
+        <w:rPr>
+          <w:rFonts w:ascii="Consolas" w:hAnsi="Consolas" w:cs="Consolas" w:eastAsia="Consolas"/>
+          <w:color w:val="000000"/>
+          <w:shd w:val="clear" w:fill="F2F2F2"/>
+          <w:sz w:val="24"/>
+          <w:szCs w:val="24"/>
+        </w:rPr>
+        <w:t xml:space="preserve">exec gosu postgres postgres ...</w:t>
+      </w:r>
+      <w:r>
+        <w:rPr>
+          <w:rFonts w:ascii="Open Sans" w:hAnsi="Open Sans" w:cs="Open Sans" w:eastAsia="Open Sans"/>
+          <w:color w:val="000000"/>
+          <w:sz w:val="24"/>
+          <w:szCs w:val="24"/>
+        </w:rPr>
+        <w:t xml:space="preserve"> explícito. E como o script inteiro passou a rodar como    root, os arquivos do </w:t>
+      </w:r>
+      <w:r>
+        <w:rPr>
+          <w:rFonts w:ascii="Consolas" w:hAnsi="Consolas" w:cs="Consolas" w:eastAsia="Consolas"/>
+          <w:color w:val="000000"/>
+          <w:shd w:val="clear" w:fill="F2F2F2"/>
+          <w:sz w:val="24"/>
+          <w:szCs w:val="24"/>
+        </w:rPr>
+        <w:t xml:space="preserve">pg_basebackup</w:t>
+      </w:r>
+      <w:r>
+        <w:rPr>
+          <w:rFonts w:ascii="Open Sans" w:hAnsi="Open Sans" w:cs="Open Sans" w:eastAsia="Open Sans"/>
+          <w:color w:val="000000"/>
+          <w:sz w:val="24"/>
+          <w:szCs w:val="24"/>
+        </w:rPr>
+        <w:t xml:space="preserve"> ficavam com dono </w:t>
+      </w:r>
+      <w:r>
+        <w:rPr>
+          <w:rFonts w:ascii="Consolas" w:hAnsi="Consolas" w:cs="Consolas" w:eastAsia="Consolas"/>
+          <w:color w:val="000000"/>
+          <w:shd w:val="clear" w:fill="F2F2F2"/>
+          <w:sz w:val="24"/>
+          <w:szCs w:val="24"/>
+        </w:rPr>
+        <w:t xml:space="preserve">root</w:t>
+      </w:r>
+      <w:r>
+        <w:rPr>
+          <w:rFonts w:ascii="Open Sans" w:hAnsi="Open Sans" w:cs="Open Sans" w:eastAsia="Open Sans"/>
+          <w:color w:val="000000"/>
+          <w:sz w:val="24"/>
+          <w:szCs w:val="24"/>
+        </w:rPr>
+        <w:t xml:space="preserve">; faltava um </w:t>
+      </w:r>
+      <w:r>
+        <w:rPr>
+          <w:rFonts w:ascii="Consolas" w:hAnsi="Consolas" w:cs="Consolas" w:eastAsia="Consolas"/>
+          <w:color w:val="000000"/>
+          <w:shd w:val="clear" w:fill="F2F2F2"/>
+          <w:sz w:val="24"/>
+          <w:szCs w:val="24"/>
+        </w:rPr>
+        <w:t xml:space="preserve">chown -R postgres</w:t>
+      </w:r>
+      <w:r>
+        <w:rPr>
+          <w:rFonts w:ascii="Open Sans" w:hAnsi="Open Sans" w:cs="Open Sans" w:eastAsia="Open Sans"/>
+          <w:color w:val="000000"/>
+          <w:sz w:val="24"/>
+          <w:szCs w:val="24"/>
+        </w:rPr>
+        <w:t xml:space="preserve">    antes do </w:t>
+      </w:r>
+      <w:r>
+        <w:rPr>
+          <w:rFonts w:ascii="Consolas" w:hAnsi="Consolas" w:cs="Consolas" w:eastAsia="Consolas"/>
+          <w:color w:val="000000"/>
+          <w:shd w:val="clear" w:fill="F2F2F2"/>
+          <w:sz w:val="24"/>
+          <w:szCs w:val="24"/>
+        </w:rPr>
+        <w:t xml:space="preserve">gosu</w:t>
+      </w:r>
+      <w:r>
+        <w:rPr>
+          <w:rFonts w:ascii="Open Sans" w:hAnsi="Open Sans" w:cs="Open Sans" w:eastAsia="Open Sans"/>
+          <w:color w:val="000000"/>
+          <w:sz w:val="24"/>
+          <w:szCs w:val="24"/>
+        </w:rPr>
+        <w:t xml:space="preserve"> assumir.</w:t>
+      </w:r>
+    </w:p>
+    <w:p>
+      <w:pPr>
+        <w:spacing w:after="120" w:before="120" w:line="276" w:lineRule="auto"/>
+        <w:ind w:firstLine="0" w:start="0"/>
+        <w:jc w:val="both"/>
+      </w:pPr>
+      <w:r>
+        <w:rPr>
+          <w:rFonts w:ascii="Open Sans" w:hAnsi="Open Sans" w:cs="Open Sans" w:eastAsia="Open Sans"/>
+          <w:color w:val="000000"/>
+          <w:sz w:val="24"/>
+          <w:szCs w:val="24"/>
+        </w:rPr>
+        <w:t xml:space="preserve">Com as três correções, a réplica sobe, </w:t>
+      </w:r>
+      <w:r>
+        <w:rPr>
+          <w:rFonts w:ascii="Consolas" w:hAnsi="Consolas" w:cs="Consolas" w:eastAsia="Consolas"/>
+          <w:color w:val="000000"/>
+          <w:shd w:val="clear" w:fill="F2F2F2"/>
+          <w:sz w:val="24"/>
+          <w:szCs w:val="24"/>
+        </w:rPr>
+        <w:t xml:space="preserve">pg_stat_replication</w:t>
+      </w:r>
+      <w:r>
+        <w:rPr>
+          <w:rFonts w:ascii="Open Sans" w:hAnsi="Open Sans" w:cs="Open Sans" w:eastAsia="Open Sans"/>
+          <w:color w:val="000000"/>
+          <w:sz w:val="24"/>
+          <w:szCs w:val="24"/>
+        </w:rPr>
+        <w:t xml:space="preserve"> no primário mostra </w:t>
+      </w:r>
+      <w:r>
+        <w:rPr>
+          <w:rFonts w:ascii="Consolas" w:hAnsi="Consolas" w:cs="Consolas" w:eastAsia="Consolas"/>
+          <w:color w:val="000000"/>
+          <w:shd w:val="clear" w:fill="F2F2F2"/>
+          <w:sz w:val="24"/>
+          <w:szCs w:val="24"/>
+        </w:rPr>
+        <w:t xml:space="preserve">state = streaming</w:t>
+      </w:r>
+      <w:r>
+        <w:rPr>
+          <w:rFonts w:ascii="Open Sans" w:hAnsi="Open Sans" w:cs="Open Sans" w:eastAsia="Open Sans"/>
+          <w:color w:val="000000"/>
+          <w:sz w:val="24"/>
+          <w:szCs w:val="24"/>
+        </w:rPr>
+        <w:t xml:space="preserve">, um </w:t>
+      </w:r>
+      <w:r>
+        <w:rPr>
+          <w:rFonts w:ascii="Consolas" w:hAnsi="Consolas" w:cs="Consolas" w:eastAsia="Consolas"/>
+          <w:color w:val="000000"/>
+          <w:shd w:val="clear" w:fill="F2F2F2"/>
+          <w:sz w:val="24"/>
+          <w:szCs w:val="24"/>
+        </w:rPr>
+        <w:t xml:space="preserve">INSERT</w:t>
+      </w:r>
+      <w:r>
+        <w:rPr>
+          <w:rFonts w:ascii="Open Sans" w:hAnsi="Open Sans" w:cs="Open Sans" w:eastAsia="Open Sans"/>
+          <w:color w:val="000000"/>
+          <w:sz w:val="24"/>
+          <w:szCs w:val="24"/>
+        </w:rPr>
+        <w:t xml:space="preserve"> no primário aparece na réplica em menos de um segundo, e um </w:t>
+      </w:r>
+      <w:r>
+        <w:rPr>
+          <w:rFonts w:ascii="Consolas" w:hAnsi="Consolas" w:cs="Consolas" w:eastAsia="Consolas"/>
+          <w:color w:val="000000"/>
+          <w:shd w:val="clear" w:fill="F2F2F2"/>
+          <w:sz w:val="24"/>
+          <w:szCs w:val="24"/>
+        </w:rPr>
+        <w:t xml:space="preserve">INSERT</w:t>
+      </w:r>
+      <w:r>
+        <w:rPr>
+          <w:rFonts w:ascii="Open Sans" w:hAnsi="Open Sans" w:cs="Open Sans" w:eastAsia="Open Sans"/>
+          <w:color w:val="000000"/>
+          <w:sz w:val="24"/>
+          <w:szCs w:val="24"/>
+        </w:rPr>
+        <w:t xml:space="preserve"> direto na réplica falha com </w:t>
+      </w:r>
+      <w:r>
+        <w:rPr>
+          <w:rFonts w:ascii="Consolas" w:hAnsi="Consolas" w:cs="Consolas" w:eastAsia="Consolas"/>
+          <w:color w:val="000000"/>
+          <w:shd w:val="clear" w:fill="F2F2F2"/>
+          <w:sz w:val="24"/>
+          <w:szCs w:val="24"/>
+        </w:rPr>
+        <w:t xml:space="preserve">cannot execute INSERT in a read-only transaction</w:t>
+      </w:r>
+      <w:r>
+        <w:rPr>
+          <w:rFonts w:ascii="Open Sans" w:hAnsi="Open Sans" w:cs="Open Sans" w:eastAsia="Open Sans"/>
+          <w:color w:val="000000"/>
+          <w:sz w:val="24"/>
+          <w:szCs w:val="24"/>
+        </w:rPr>
+        <w:t xml:space="preserve"> — o comportamento que a seção 5.2 descrevia, agora confirmado rodando.</w:t>
+      </w:r>
+    </w:p>
+    <w:p>
+      <w:pPr>
+        <w:spacing w:after="120" w:before="120" w:line="276" w:lineRule="auto"/>
+        <w:ind w:firstLine="0" w:start="0"/>
+        <w:jc w:val="both"/>
+      </w:pPr>
+      <w:r>
+        <w:rPr>
+          <w:rFonts w:ascii="Open Sans" w:hAnsi="Open Sans" w:cs="Open Sans" w:eastAsia="Open Sans"/>
+          <w:b/>
+          <w:bCs/>
+          <w:color w:val="000000"/>
+          <w:sz w:val="24"/>
+          <w:szCs w:val="24"/>
+        </w:rPr>
+        <w:t xml:space="preserve">`jogadores:online` só encolhia com desconexão educada.</w:t>
+      </w:r>
+      <w:r>
+        <w:rPr>
+          <w:rFonts w:ascii="Open Sans" w:hAnsi="Open Sans" w:cs="Open Sans" w:eastAsia="Open Sans"/>
+          <w:color w:val="000000"/>
+          <w:sz w:val="24"/>
+          <w:szCs w:val="24"/>
+        </w:rPr>
+        <w:t xml:space="preserve"> O </w:t>
+      </w:r>
+      <w:r>
+        <w:rPr>
+          <w:rFonts w:ascii="Consolas" w:hAnsi="Consolas" w:cs="Consolas" w:eastAsia="Consolas"/>
+          <w:color w:val="000000"/>
+          <w:shd w:val="clear" w:fill="F2F2F2"/>
+          <w:sz w:val="24"/>
+          <w:szCs w:val="24"/>
+        </w:rPr>
+        <w:t xml:space="preserve">GameHub</w:t>
+      </w:r>
+      <w:r>
+        <w:rPr>
+          <w:rFonts w:ascii="Open Sans" w:hAnsi="Open Sans" w:cs="Open Sans" w:eastAsia="Open Sans"/>
+          <w:color w:val="000000"/>
+          <w:sz w:val="24"/>
+          <w:szCs w:val="24"/>
+        </w:rPr>
+        <w:t xml:space="preserve"> (seção 4.6) nunca sobrescrevia </w:t>
+      </w:r>
+      <w:r>
+        <w:rPr>
+          <w:rFonts w:ascii="Consolas" w:hAnsi="Consolas" w:cs="Consolas" w:eastAsia="Consolas"/>
+          <w:color w:val="000000"/>
+          <w:shd w:val="clear" w:fill="F2F2F2"/>
+          <w:sz w:val="24"/>
+          <w:szCs w:val="24"/>
+        </w:rPr>
+        <w:t xml:space="preserve">OnDisconnectedAsync</w:t>
+      </w:r>
+      <w:r>
+        <w:rPr>
+          <w:rFonts w:ascii="Open Sans" w:hAnsi="Open Sans" w:cs="Open Sans" w:eastAsia="Open Sans"/>
+          <w:color w:val="000000"/>
+          <w:sz w:val="24"/>
+          <w:szCs w:val="24"/>
+        </w:rPr>
+        <w:t xml:space="preserve">: o Set só perdia um jogador quando o cliente chamava </w:t>
+      </w:r>
+      <w:r>
+        <w:rPr>
+          <w:rFonts w:ascii="Consolas" w:hAnsi="Consolas" w:cs="Consolas" w:eastAsia="Consolas"/>
+          <w:color w:val="000000"/>
+          <w:shd w:val="clear" w:fill="F2F2F2"/>
+          <w:sz w:val="24"/>
+          <w:szCs w:val="24"/>
+        </w:rPr>
+        <w:t xml:space="preserve">LeaveRoom</w:t>
+      </w:r>
+      <w:r>
+        <w:rPr>
+          <w:rFonts w:ascii="Open Sans" w:hAnsi="Open Sans" w:cs="Open Sans" w:eastAsia="Open Sans"/>
+          <w:color w:val="000000"/>
+          <w:sz w:val="24"/>
+          <w:szCs w:val="24"/>
+        </w:rPr>
+        <w:t xml:space="preserve"> explicitamente. Queda de conexão, aba fechada ou crash do app — o caminho mais comum de desconexão numa partida — deixavam o jogador para sempre no Set, inflando </w:t>
+      </w:r>
+      <w:r>
+        <w:rPr>
+          <w:rFonts w:ascii="Consolas" w:hAnsi="Consolas" w:cs="Consolas" w:eastAsia="Consolas"/>
+          <w:color w:val="000000"/>
+          <w:shd w:val="clear" w:fill="F2F2F2"/>
+          <w:sz w:val="24"/>
+          <w:szCs w:val="24"/>
+        </w:rPr>
+        <w:t xml:space="preserve">SCARD</w:t>
+      </w:r>
+      <w:r>
+        <w:rPr>
+          <w:rFonts w:ascii="Open Sans" w:hAnsi="Open Sans" w:cs="Open Sans" w:eastAsia="Open Sans"/>
+          <w:color w:val="000000"/>
+          <w:sz w:val="24"/>
+          <w:szCs w:val="24"/>
+        </w:rPr>
+        <w:t xml:space="preserve"> com o tempo. A correção mapeia </w:t>
+      </w:r>
+      <w:r>
+        <w:rPr>
+          <w:rFonts w:ascii="Consolas" w:hAnsi="Consolas" w:cs="Consolas" w:eastAsia="Consolas"/>
+          <w:color w:val="000000"/>
+          <w:shd w:val="clear" w:fill="F2F2F2"/>
+          <w:sz w:val="24"/>
+          <w:szCs w:val="24"/>
+        </w:rPr>
+        <w:t xml:space="preserve">ConnectionId → (RoomId, PlayerId)</w:t>
+      </w:r>
+      <w:r>
+        <w:rPr>
+          <w:rFonts w:ascii="Open Sans" w:hAnsi="Open Sans" w:cs="Open Sans" w:eastAsia="Open Sans"/>
+          <w:color w:val="000000"/>
+          <w:sz w:val="24"/>
+          <w:szCs w:val="24"/>
+        </w:rPr>
+        <w:t xml:space="preserve"> no </w:t>
+      </w:r>
+      <w:r>
+        <w:rPr>
+          <w:rFonts w:ascii="Consolas" w:hAnsi="Consolas" w:cs="Consolas" w:eastAsia="Consolas"/>
+          <w:color w:val="000000"/>
+          <w:shd w:val="clear" w:fill="F2F2F2"/>
+          <w:sz w:val="24"/>
+          <w:szCs w:val="24"/>
+        </w:rPr>
+        <w:t xml:space="preserve">JoinRoom</w:t>
+      </w:r>
+      <w:r>
+        <w:rPr>
+          <w:rFonts w:ascii="Open Sans" w:hAnsi="Open Sans" w:cs="Open Sans" w:eastAsia="Open Sans"/>
+          <w:color w:val="000000"/>
+          <w:sz w:val="24"/>
+          <w:szCs w:val="24"/>
+        </w:rPr>
+        <w:t xml:space="preserve"> e usa esse mapa em </w:t>
+      </w:r>
+      <w:r>
+        <w:rPr>
+          <w:rFonts w:ascii="Consolas" w:hAnsi="Consolas" w:cs="Consolas" w:eastAsia="Consolas"/>
+          <w:color w:val="000000"/>
+          <w:shd w:val="clear" w:fill="F2F2F2"/>
+          <w:sz w:val="24"/>
+          <w:szCs w:val="24"/>
+        </w:rPr>
+        <w:t xml:space="preserve">OnDisconnectedAsync</w:t>
+      </w:r>
+      <w:r>
+        <w:rPr>
+          <w:rFonts w:ascii="Open Sans" w:hAnsi="Open Sans" w:cs="Open Sans" w:eastAsia="Open Sans"/>
+          <w:color w:val="000000"/>
+          <w:sz w:val="24"/>
+          <w:szCs w:val="24"/>
+        </w:rPr>
+        <w:t xml:space="preserve"> para repetir a mesma limpeza que </w:t>
+      </w:r>
+      <w:r>
+        <w:rPr>
+          <w:rFonts w:ascii="Consolas" w:hAnsi="Consolas" w:cs="Consolas" w:eastAsia="Consolas"/>
+          <w:color w:val="000000"/>
+          <w:shd w:val="clear" w:fill="F2F2F2"/>
+          <w:sz w:val="24"/>
+          <w:szCs w:val="24"/>
+        </w:rPr>
+        <w:t xml:space="preserve">LeaveRoom</w:t>
+      </w:r>
+      <w:r>
+        <w:rPr>
+          <w:rFonts w:ascii="Open Sans" w:hAnsi="Open Sans" w:cs="Open Sans" w:eastAsia="Open Sans"/>
+          <w:color w:val="000000"/>
+          <w:sz w:val="24"/>
+          <w:szCs w:val="24"/>
+        </w:rPr>
+        <w:t xml:space="preserve"> já fazia.</w:t>
+      </w:r>
+    </w:p>
+    <w:p>
+      <w:pPr>
+        <w:spacing w:after="120" w:before="120" w:line="276" w:lineRule="auto"/>
+        <w:ind w:firstLine="0" w:start="0"/>
+        <w:jc w:val="both"/>
+      </w:pPr>
+      <w:r>
+        <w:rPr>
+          <w:rFonts w:ascii="Open Sans" w:hAnsi="Open Sans" w:cs="Open Sans" w:eastAsia="Open Sans"/>
+          <w:color w:val="000000"/>
+          <w:sz w:val="24"/>
+          <w:szCs w:val="24"/>
+        </w:rPr>
+        <w:t xml:space="preserve">Um terceiro ponto ficou identificado mas </w:t>
+      </w:r>
+      <w:r>
+        <w:rPr>
+          <w:rFonts w:ascii="Open Sans" w:hAnsi="Open Sans" w:cs="Open Sans" w:eastAsia="Open Sans"/>
+          <w:b/>
+          <w:bCs/>
+          <w:color w:val="000000"/>
+          <w:sz w:val="24"/>
+          <w:szCs w:val="24"/>
+        </w:rPr>
+        <w:t xml:space="preserve">não corrigido</w:t>
+      </w:r>
+      <w:r>
+        <w:rPr>
+          <w:rFonts w:ascii="Open Sans" w:hAnsi="Open Sans" w:cs="Open Sans" w:eastAsia="Open Sans"/>
+          <w:color w:val="000000"/>
+          <w:sz w:val="24"/>
+          <w:szCs w:val="24"/>
+        </w:rPr>
+        <w:t xml:space="preserve">, por estar fora do escopo do que foi testado agora: </w:t>
+      </w:r>
+      <w:r>
+        <w:rPr>
+          <w:rFonts w:ascii="Consolas" w:hAnsi="Consolas" w:cs="Consolas" w:eastAsia="Consolas"/>
+          <w:color w:val="000000"/>
+          <w:shd w:val="clear" w:fill="F2F2F2"/>
+          <w:sz w:val="24"/>
+          <w:szCs w:val="24"/>
+        </w:rPr>
+        <w:t xml:space="preserve">RevogarTokenAsync</w:t>
+      </w:r>
+      <w:r>
+        <w:rPr>
+          <w:rFonts w:ascii="Open Sans" w:hAnsi="Open Sans" w:cs="Open Sans" w:eastAsia="Open Sans"/>
+          <w:color w:val="000000"/>
+          <w:sz w:val="24"/>
+          <w:szCs w:val="24"/>
+        </w:rPr>
+        <w:t xml:space="preserve">/</w:t>
+      </w:r>
+      <w:r>
+        <w:rPr>
+          <w:rFonts w:ascii="Consolas" w:hAnsi="Consolas" w:cs="Consolas" w:eastAsia="Consolas"/>
+          <w:color w:val="000000"/>
+          <w:shd w:val="clear" w:fill="F2F2F2"/>
+          <w:sz w:val="24"/>
+          <w:szCs w:val="24"/>
+        </w:rPr>
+        <w:t xml:space="preserve">TokenRevogadoAsync</w:t>
+      </w:r>
+      <w:r>
+        <w:rPr>
+          <w:rFonts w:ascii="Open Sans" w:hAnsi="Open Sans" w:cs="Open Sans" w:eastAsia="Open Sans"/>
+          <w:color w:val="000000"/>
+          <w:sz w:val="24"/>
+          <w:szCs w:val="24"/>
+        </w:rPr>
+        <w:t xml:space="preserve"> (seção 4.7) funcionam corretamente isolados, mas nenhum endpoint de logout chama </w:t>
+      </w:r>
+      <w:r>
+        <w:rPr>
+          <w:rFonts w:ascii="Consolas" w:hAnsi="Consolas" w:cs="Consolas" w:eastAsia="Consolas"/>
+          <w:color w:val="000000"/>
+          <w:shd w:val="clear" w:fill="F2F2F2"/>
+          <w:sz w:val="24"/>
+          <w:szCs w:val="24"/>
+        </w:rPr>
+        <w:t xml:space="preserve">RevogarTokenAsync</w:t>
+      </w:r>
+      <w:r>
+        <w:rPr>
+          <w:rFonts w:ascii="Open Sans" w:hAnsi="Open Sans" w:cs="Open Sans" w:eastAsia="Open Sans"/>
+          <w:color w:val="000000"/>
+          <w:sz w:val="24"/>
+          <w:szCs w:val="24"/>
+        </w:rPr>
+        <w:t xml:space="preserve">, e nada no pipeline de autenticação consulta </w:t>
+      </w:r>
+      <w:r>
+        <w:rPr>
+          <w:rFonts w:ascii="Consolas" w:hAnsi="Consolas" w:cs="Consolas" w:eastAsia="Consolas"/>
+          <w:color w:val="000000"/>
+          <w:shd w:val="clear" w:fill="F2F2F2"/>
+          <w:sz w:val="24"/>
+          <w:szCs w:val="24"/>
+        </w:rPr>
+        <w:t xml:space="preserve">TokenRevogadoAsync</w:t>
+      </w:r>
+      <w:r>
+        <w:rPr>
+          <w:rFonts w:ascii="Open Sans" w:hAnsi="Open Sans" w:cs="Open Sans" w:eastAsia="Open Sans"/>
+          <w:color w:val="000000"/>
+          <w:sz w:val="24"/>
+          <w:szCs w:val="24"/>
+        </w:rPr>
+        <w:t xml:space="preserve"> — hoje a revogação existe como código morto, sem efeito sobre requisições reais.</w:t>
+      </w:r>
+    </w:p>
+    <w:p>
+      <w:pPr>
+        <w:spacing w:after="120" w:before="240" w:line="276" w:lineRule="auto"/>
+        <w:ind w:firstLine="0" w:start="0"/>
+        <w:jc w:val="start"/>
+      </w:pPr>
+      <w:r>
+        <w:rPr>
+          <w:rFonts w:ascii="Open Sans" w:hAnsi="Open Sans" w:cs="Open Sans" w:eastAsia="Open Sans"/>
+          <w:b/>
+          <w:bCs/>
+          <w:color w:val="000000"/>
           <w:sz w:val="30"/>
           <w:szCs w:val="30"/>
         </w:rPr>
@@ -5344,7 +7140,141 @@
           <w:sz w:val="24"/>
           <w:szCs w:val="24"/>
         </w:rPr>
-        <w:t xml:space="preserve">O passo seguinte antes da apresentação é medir. Todo ganho descrito aqui é previsão fundamentada, e previsão fundamentada continua sendo previsão até o </w:t>
+        <w:t xml:space="preserve">Uma quarta lição veio de fora da análise de banco: </w:t>
+      </w:r>
+      <w:r>
+        <w:rPr>
+          <w:rFonts w:ascii="Open Sans" w:hAnsi="Open Sans" w:cs="Open Sans" w:eastAsia="Open Sans"/>
+          <w:b/>
+          <w:bCs/>
+          <w:color w:val="000000"/>
+          <w:sz w:val="24"/>
+          <w:szCs w:val="24"/>
+        </w:rPr>
+        <w:t xml:space="preserve">rodar é diferente de ler.</w:t>
+      </w:r>
+      <w:r>
+        <w:rPr>
+          <w:rFonts w:ascii="Open Sans" w:hAnsi="Open Sans" w:cs="Open Sans" w:eastAsia="Open Sans"/>
+          <w:color w:val="000000"/>
+          <w:sz w:val="24"/>
+          <w:szCs w:val="24"/>
+        </w:rPr>
+        <w:t xml:space="preserve"> O </w:t>
+      </w:r>
+      <w:r>
+        <w:rPr>
+          <w:rFonts w:ascii="Consolas" w:hAnsi="Consolas" w:cs="Consolas" w:eastAsia="Consolas"/>
+          <w:color w:val="000000"/>
+          <w:shd w:val="clear" w:fill="F2F2F2"/>
+          <w:sz w:val="24"/>
+          <w:szCs w:val="24"/>
+        </w:rPr>
+        <w:t xml:space="preserve">docker-compose.yml</w:t>
+      </w:r>
+      <w:r>
+        <w:rPr>
+          <w:rFonts w:ascii="Open Sans" w:hAnsi="Open Sans" w:cs="Open Sans" w:eastAsia="Open Sans"/>
+          <w:color w:val="000000"/>
+          <w:sz w:val="24"/>
+          <w:szCs w:val="24"/>
+        </w:rPr>
+        <w:t xml:space="preserve"> da réplica de leitura parecia correto na leitura — três defeitos diferentes (YAML, </w:t>
+      </w:r>
+      <w:r>
+        <w:rPr>
+          <w:rFonts w:ascii="Consolas" w:hAnsi="Consolas" w:cs="Consolas" w:eastAsia="Consolas"/>
+          <w:color w:val="000000"/>
+          <w:shd w:val="clear" w:fill="F2F2F2"/>
+          <w:sz w:val="24"/>
+          <w:szCs w:val="24"/>
+        </w:rPr>
+        <w:t xml:space="preserve">pg_hba.conf</w:t>
+      </w:r>
+      <w:r>
+        <w:rPr>
+          <w:rFonts w:ascii="Open Sans" w:hAnsi="Open Sans" w:cs="Open Sans" w:eastAsia="Open Sans"/>
+          <w:color w:val="000000"/>
+          <w:sz w:val="24"/>
+          <w:szCs w:val="24"/>
+        </w:rPr>
+        <w:t xml:space="preserve">, usuário do processo) só apareceram ao executar </w:t>
+      </w:r>
+      <w:r>
+        <w:rPr>
+          <w:rFonts w:ascii="Consolas" w:hAnsi="Consolas" w:cs="Consolas" w:eastAsia="Consolas"/>
+          <w:color w:val="000000"/>
+          <w:shd w:val="clear" w:fill="F2F2F2"/>
+          <w:sz w:val="24"/>
+          <w:szCs w:val="24"/>
+        </w:rPr>
+        <w:t xml:space="preserve">docker compose up</w:t>
+      </w:r>
+      <w:r>
+        <w:rPr>
+          <w:rFonts w:ascii="Open Sans" w:hAnsi="Open Sans" w:cs="Open Sans" w:eastAsia="Open Sans"/>
+          <w:color w:val="000000"/>
+          <w:sz w:val="24"/>
+          <w:szCs w:val="24"/>
+        </w:rPr>
+        <w:t xml:space="preserve"> de verdade, e o mesmo vale para o </w:t>
+      </w:r>
+      <w:r>
+        <w:rPr>
+          <w:rFonts w:ascii="Consolas" w:hAnsi="Consolas" w:cs="Consolas" w:eastAsia="Consolas"/>
+          <w:color w:val="000000"/>
+          <w:shd w:val="clear" w:fill="F2F2F2"/>
+          <w:sz w:val="24"/>
+          <w:szCs w:val="24"/>
+        </w:rPr>
+        <w:t xml:space="preserve">OnDisconnectedAsync</w:t>
+      </w:r>
+      <w:r>
+        <w:rPr>
+          <w:rFonts w:ascii="Open Sans" w:hAnsi="Open Sans" w:cs="Open Sans" w:eastAsia="Open Sans"/>
+          <w:color w:val="000000"/>
+          <w:sz w:val="24"/>
+          <w:szCs w:val="24"/>
+        </w:rPr>
+        <w:t xml:space="preserve"> que faltava no </w:t>
+      </w:r>
+      <w:r>
+        <w:rPr>
+          <w:rFonts w:ascii="Consolas" w:hAnsi="Consolas" w:cs="Consolas" w:eastAsia="Consolas"/>
+          <w:color w:val="000000"/>
+          <w:shd w:val="clear" w:fill="F2F2F2"/>
+          <w:sz w:val="24"/>
+          <w:szCs w:val="24"/>
+        </w:rPr>
+        <w:t xml:space="preserve">GameHub</w:t>
+      </w:r>
+      <w:r>
+        <w:rPr>
+          <w:rFonts w:ascii="Open Sans" w:hAnsi="Open Sans" w:cs="Open Sans" w:eastAsia="Open Sans"/>
+          <w:color w:val="000000"/>
+          <w:sz w:val="24"/>
+          <w:szCs w:val="24"/>
+        </w:rPr>
+        <w:t xml:space="preserve">. Os ganhos de índice e </w:t>
+      </w:r>
+      <w:r>
+        <w:rPr>
+          <w:rFonts w:ascii="Consolas" w:hAnsi="Consolas" w:cs="Consolas" w:eastAsia="Consolas"/>
+          <w:color w:val="000000"/>
+          <w:shd w:val="clear" w:fill="F2F2F2"/>
+          <w:sz w:val="24"/>
+          <w:szCs w:val="24"/>
+        </w:rPr>
+        <w:t xml:space="preserve">AsNoTracking()</w:t>
+      </w:r>
+      <w:r>
+        <w:rPr>
+          <w:rFonts w:ascii="Open Sans" w:hAnsi="Open Sans" w:cs="Open Sans" w:eastAsia="Open Sans"/>
+          <w:color w:val="000000"/>
+          <w:sz w:val="24"/>
+          <w:szCs w:val="24"/>
+        </w:rPr>
+        <w:t xml:space="preserve"> deixaram de ser previsão fundamentada: a seção 6.1 traz os números medidos com </w:t>
       </w:r>
       <w:r>
         <w:rPr>
@@ -5363,7 +7293,26 @@
           <w:sz w:val="24"/>
           <w:szCs w:val="24"/>
         </w:rPr>
-        <w:t xml:space="preserve"> confirmar.</w:t>
+        <w:t xml:space="preserve"> e um comparativo de tempo/alocação sobre PostgreSQL e Redis reais, e a seção 6.2 documenta os dois bugs que a execução expôs e que já foram corrigidos na branch </w:t>
+      </w:r>
+      <w:r>
+        <w:rPr>
+          <w:rFonts w:ascii="Consolas" w:hAnsi="Consolas" w:cs="Consolas" w:eastAsia="Consolas"/>
+          <w:color w:val="000000"/>
+          <w:shd w:val="clear" w:fill="F2F2F2"/>
+          <w:sz w:val="24"/>
+          <w:szCs w:val="24"/>
+        </w:rPr>
+        <w:t xml:space="preserve">lab7-djordan</w:t>
+      </w:r>
+      <w:r>
+        <w:rPr>
+          <w:rFonts w:ascii="Open Sans" w:hAnsi="Open Sans" w:cs="Open Sans" w:eastAsia="Open Sans"/>
+          <w:color w:val="000000"/>
+          <w:sz w:val="24"/>
+          <w:szCs w:val="24"/>
+        </w:rPr>
+        <w:t xml:space="preserve">.</w:t>
       </w:r>
     </w:p>
     <w:p>

</xml_diff>